<commit_message>
AIBQ section: dimension-level only; rename MD to Moat Durability
Opening section rewritten to focus on the five main dimensions, with the
sub-score tables removed and their strongest evidence folded into each
dimension's prose. 'Moat and Defensibility' renamed 'Moat Durability'
across the section, the Appraisal, and the radar chart axis. 33 pages,
Contents re-measured and converged.

Co-Authored-By: Claude Fable 5 <noreply@anthropic.com>
Claude-Session: https://claude.ai/code/session_01TXNrMQSsp5SsvaYzynqJ6k
</commit_message>
<xml_diff>
--- a/output/Databricks_BrickByBrick_Jul2026.docx
+++ b/output/Databricks_BrickByBrick_Jul2026.docx
@@ -1237,7 +1237,7 @@
                 <w:color w:val="6B7280"/>
                 <w:sz w:val="17"/>
               </w:rPr>
-              <w:t>10</w:t>
+              <w:t>8</w:t>
             </w:r>
           </w:p>
         </w:tc>
@@ -1283,7 +1283,7 @@
                 <w:color w:val="6B7280"/>
                 <w:sz w:val="17"/>
               </w:rPr>
-              <w:t>12</w:t>
+              <w:t>10</w:t>
             </w:r>
           </w:p>
         </w:tc>
@@ -1329,7 +1329,7 @@
                 <w:color w:val="6B7280"/>
                 <w:sz w:val="17"/>
               </w:rPr>
-              <w:t>13</w:t>
+              <w:t>11</w:t>
             </w:r>
           </w:p>
         </w:tc>
@@ -1375,7 +1375,7 @@
                 <w:color w:val="6B7280"/>
                 <w:sz w:val="17"/>
               </w:rPr>
-              <w:t>16</w:t>
+              <w:t>14</w:t>
             </w:r>
           </w:p>
         </w:tc>
@@ -1421,7 +1421,7 @@
                 <w:color w:val="6B7280"/>
                 <w:sz w:val="17"/>
               </w:rPr>
-              <w:t>18</w:t>
+              <w:t>16</w:t>
             </w:r>
           </w:p>
         </w:tc>
@@ -1467,7 +1467,7 @@
                 <w:color w:val="6B7280"/>
                 <w:sz w:val="17"/>
               </w:rPr>
-              <w:t>20</w:t>
+              <w:t>18</w:t>
             </w:r>
           </w:p>
         </w:tc>
@@ -1513,7 +1513,7 @@
                 <w:color w:val="6B7280"/>
                 <w:sz w:val="17"/>
               </w:rPr>
-              <w:t>22</w:t>
+              <w:t>20</w:t>
             </w:r>
           </w:p>
         </w:tc>
@@ -1559,7 +1559,7 @@
                 <w:color w:val="6B7280"/>
                 <w:sz w:val="17"/>
               </w:rPr>
-              <w:t>26</w:t>
+              <w:t>24</w:t>
             </w:r>
           </w:p>
         </w:tc>
@@ -1605,7 +1605,7 @@
                 <w:color w:val="6B7280"/>
                 <w:sz w:val="17"/>
               </w:rPr>
-              <w:t>30</w:t>
+              <w:t>28</w:t>
             </w:r>
           </w:p>
         </w:tc>
@@ -1651,7 +1651,7 @@
                 <w:color w:val="6B7280"/>
                 <w:sz w:val="17"/>
               </w:rPr>
-              <w:t>33</w:t>
+              <w:t>31</w:t>
             </w:r>
           </w:p>
         </w:tc>
@@ -1697,7 +1697,7 @@
                 <w:color w:val="6B7280"/>
                 <w:sz w:val="17"/>
               </w:rPr>
-              <w:t>35</w:t>
+              <w:t>33</w:t>
             </w:r>
           </w:p>
         </w:tc>
@@ -1767,7 +1767,7 @@
                 <w:color w:val="6B7280"/>
                 <w:sz w:val="17"/>
               </w:rPr>
-              <w:t>8</w:t>
+              <w:t>6</w:t>
             </w:r>
           </w:p>
         </w:tc>
@@ -1813,7 +1813,7 @@
                 <w:color w:val="6B7280"/>
                 <w:sz w:val="17"/>
               </w:rPr>
-              <w:t>11</w:t>
+              <w:t>9</w:t>
             </w:r>
           </w:p>
         </w:tc>
@@ -1859,7 +1859,7 @@
                 <w:color w:val="6B7280"/>
                 <w:sz w:val="17"/>
               </w:rPr>
-              <w:t>13</w:t>
+              <w:t>11</w:t>
             </w:r>
           </w:p>
         </w:tc>
@@ -1905,7 +1905,7 @@
                 <w:color w:val="6B7280"/>
                 <w:sz w:val="17"/>
               </w:rPr>
-              <w:t>24</w:t>
+              <w:t>22</w:t>
             </w:r>
           </w:p>
         </w:tc>
@@ -1951,7 +1951,7 @@
                 <w:color w:val="6B7280"/>
                 <w:sz w:val="17"/>
               </w:rPr>
-              <w:t>25</w:t>
+              <w:t>23</w:t>
             </w:r>
           </w:p>
         </w:tc>
@@ -1997,7 +1997,7 @@
                 <w:color w:val="6B7280"/>
                 <w:sz w:val="17"/>
               </w:rPr>
-              <w:t>26</w:t>
+              <w:t>24</w:t>
             </w:r>
           </w:p>
         </w:tc>
@@ -2043,7 +2043,7 @@
                 <w:color w:val="6B7280"/>
                 <w:sz w:val="17"/>
               </w:rPr>
-              <w:t>27</w:t>
+              <w:t>25</w:t>
             </w:r>
           </w:p>
         </w:tc>
@@ -2089,7 +2089,7 @@
                 <w:color w:val="6B7280"/>
                 <w:sz w:val="17"/>
               </w:rPr>
-              <w:t>28</w:t>
+              <w:t>26</w:t>
             </w:r>
           </w:p>
         </w:tc>
@@ -2135,7 +2135,7 @@
                 <w:color w:val="6B7280"/>
                 <w:sz w:val="17"/>
               </w:rPr>
-              <w:t>31</w:t>
+              <w:t>29</w:t>
             </w:r>
           </w:p>
         </w:tc>
@@ -2181,7 +2181,7 @@
                 <w:color w:val="6B7280"/>
                 <w:sz w:val="17"/>
               </w:rPr>
-              <w:t>32</w:t>
+              <w:t>30</w:t>
             </w:r>
           </w:p>
         </w:tc>
@@ -2227,7 +2227,7 @@
                 <w:color w:val="6B7280"/>
                 <w:sz w:val="17"/>
               </w:rPr>
-              <w:t>32</w:t>
+              <w:t>30</w:t>
             </w:r>
           </w:p>
         </w:tc>
@@ -2253,7 +2253,7 @@
           <w:color w:val="262B35"/>
           <w:sz w:val="21"/>
         </w:rPr>
-        <w:t>Before the story, the score. This section is deliberately standalone: it lays out the AI Business Quality (AIBQ) framework, decomposes every one of the 24 sub-scores behind Databricks' 8.81 composite, explains what moved since the prior score, and places the company in its cohort. A reader who stops at the end of this section will know exactly what is being claimed about business quality and exactly which published number would falsify it. The rest of the report then supplies the evidence underneath each score, layer by layer.</w:t>
+        <w:t>Before the story, the score. This section is deliberately standalone: it lays out the AI Business Quality (AIBQ) framework, works through each of the five dimensions behind Databricks' 8.81 composite, explains what moved since the prior score, and places the company in its cohort. A reader who stops at the end of this section will know exactly what is being claimed about business quality and exactly which published number would falsify it. The rest of the report then supplies the evidence underneath each dimension, layer by layer.</w:t>
       </w:r>
     </w:p>
     <w:p>
@@ -2276,7 +2276,7 @@
           <w:color w:val="262B35"/>
           <w:sz w:val="21"/>
         </w:rPr>
-        <w:t>AIBQ scores durable business quality, deliberately independent of valuation, across five weighted dimensions on a 0-to-10 scale, summed to a composite less a contextual risk adjustment (CRA): Composite = 0.20 CE + 0.25 RQ + 0.15 CI + 0.20 GO + 0.20 MD, minus CRA. Revenue Quality carries the largest weight because, across our coverage history, it best predicts which growth stories survive the transition to durable franchise. Each dimension is built from named sub-scores (five for CE, RQ, GO, and MD; four for CI; 24 in total) that average simply within their dimension.</w:t>
+        <w:t>AIBQ scores durable business quality, deliberately independent of valuation, across five weighted dimensions on a 0-to-10 scale, summed to a composite less a contextual risk adjustment (CRA): Composite = 0.20 CE + 0.25 RQ + 0.15 CI + 0.20 GO + 0.20 MD, minus CRA. Revenue Quality carries the largest weight because, across our coverage history, it best predicts which growth stories survive the transition to durable franchise. Each dimension aggregates a set of internal sub-scores that average within it; this report presents and defends the dimension level.</w:t>
       </w:r>
     </w:p>
     <w:p>
@@ -2708,7 +2708,7 @@
                 <w:color w:val="262B35"/>
                 <w:sz w:val="16"/>
               </w:rPr>
-              <w:t>Moat and Defensibility (MD)</w:t>
+              <w:t>Moat Durability (MD)</w:t>
             </w:r>
           </w:p>
         </w:tc>
@@ -3331,7 +3331,7 @@
                 <w:color w:val="262B35"/>
                 <w:sz w:val="16"/>
               </w:rPr>
-              <w:t>Moat and Defensibility</w:t>
+              <w:t>Moat Durability</w:t>
             </w:r>
           </w:p>
         </w:tc>
@@ -3720,501 +3720,7 @@
           <w:color w:val="262B35"/>
           <w:sz w:val="21"/>
         </w:rPr>
-        <w:t>CE asks one question: how much durable revenue does a dollar of equity buy? Databricks converts roughly $20.2 billion of lifetime equity (PitchBook 21-deal record, July 2026) into $6.9 billion of run-rate revenue, 0.34x, the best in the cohort save Anthropic, and it is the only cohort member whose marginal growth requires no new equity at all because the business self-funds. The gate is met on all three legs, with the margin leg binding: 74% against the 70% floor, guided lower on agent-driven compute (company disclosure, June 16, 2026). That cushion, roughly four points, is why CE is 8.9 rather than higher, and why the next quarterly print is the single most important data point in this report.</w:t>
-      </w:r>
-    </w:p>
-    <w:p>
-      <w:pPr>
-        <w:keepNext/>
-        <w:spacing w:after="60"/>
-        <w:jc w:val="left"/>
-      </w:pPr>
-      <w:r>
-        <w:rPr>
-          <w:b/>
-          <w:i w:val="0"/>
-          <w:color w:val="1F2A44"/>
-          <w:sz w:val="19"/>
-        </w:rPr>
-        <w:t>CE sub-scores (5)</w:t>
-      </w:r>
-    </w:p>
-    <w:tbl>
-      <w:tblPr>
-        <w:tblW w:type="dxa" w:w="9360"/>
-        <w:jc w:val="center"/>
-        <w:tblLayout w:type="fixed"/>
-        <w:tblLook w:firstColumn="1" w:firstRow="1" w:lastColumn="0" w:lastRow="0" w:noHBand="0" w:noVBand="1" w:val="04A0"/>
-        <w:tblBorders>
-          <w:top w:val="single" w:sz="4" w:space="0" w:color="C9D2DE"/>
-          <w:left w:val="single" w:sz="4" w:space="0" w:color="C9D2DE"/>
-          <w:bottom w:val="single" w:sz="4" w:space="0" w:color="C9D2DE"/>
-          <w:right w:val="single" w:sz="4" w:space="0" w:color="C9D2DE"/>
-          <w:insideH w:val="single" w:sz="4" w:space="0" w:color="C9D2DE"/>
-          <w:insideV w:val="single" w:sz="4" w:space="0" w:color="C9D2DE"/>
-        </w:tblBorders>
-        <w:tblCellMar>
-          <w:top w:w="40" w:type="dxa"/>
-          <w:left w:w="80" w:type="dxa"/>
-          <w:bottom w:w="40" w:type="dxa"/>
-          <w:right w:w="80" w:type="dxa"/>
-        </w:tblCellMar>
-      </w:tblPr>
-      <w:tblGrid>
-        <w:gridCol w:w="3120"/>
-        <w:gridCol w:w="3120"/>
-        <w:gridCol w:w="3120"/>
-      </w:tblGrid>
-      <w:tr>
-        <w:trPr>
-          <w:cantSplit/>
-          <w:tblHeader w:val="true"/>
-        </w:trPr>
-        <w:tc>
-          <w:tcPr>
-            <w:tcW w:type="dxa" w:w="2645"/>
-            <w:shd w:val="clear" w:fill="1F2A44"/>
-          </w:tcPr>
-          <w:p>
-            <w:pPr>
-              <w:spacing w:after="0"/>
-              <w:jc w:val="left"/>
-            </w:pPr>
-            <w:r/>
-            <w:r>
-              <w:rPr>
-                <w:rFonts w:ascii="Georgia" w:hAnsi="Georgia"/>
-                <w:b/>
-                <w:i w:val="0"/>
-                <w:color w:val="FFFFFF"/>
-                <w:sz w:val="17"/>
-              </w:rPr>
-              <w:t>Sub-score</w:t>
-            </w:r>
-          </w:p>
-        </w:tc>
-        <w:tc>
-          <w:tcPr>
-            <w:tcW w:type="dxa" w:w="700"/>
-            <w:shd w:val="clear" w:fill="1F2A44"/>
-          </w:tcPr>
-          <w:p>
-            <w:pPr>
-              <w:spacing w:after="0"/>
-              <w:jc w:val="right"/>
-            </w:pPr>
-            <w:r/>
-            <w:r>
-              <w:rPr>
-                <w:rFonts w:ascii="Georgia" w:hAnsi="Georgia"/>
-                <w:b/>
-                <w:i w:val="0"/>
-                <w:color w:val="FFFFFF"/>
-                <w:sz w:val="17"/>
-              </w:rPr>
-              <w:t>Score</w:t>
-            </w:r>
-          </w:p>
-        </w:tc>
-        <w:tc>
-          <w:tcPr>
-            <w:tcW w:type="dxa" w:w="6104"/>
-            <w:shd w:val="clear" w:fill="1F2A44"/>
-          </w:tcPr>
-          <w:p>
-            <w:pPr>
-              <w:spacing w:after="0"/>
-              <w:jc w:val="left"/>
-            </w:pPr>
-            <w:r/>
-            <w:r>
-              <w:rPr>
-                <w:rFonts w:ascii="Georgia" w:hAnsi="Georgia"/>
-                <w:b/>
-                <w:i w:val="0"/>
-                <w:color w:val="FFFFFF"/>
-                <w:sz w:val="17"/>
-              </w:rPr>
-              <w:t>Basis (dated)</w:t>
-            </w:r>
-          </w:p>
-        </w:tc>
-      </w:tr>
-      <w:tr>
-        <w:trPr>
-          <w:cantSplit/>
-        </w:trPr>
-        <w:tc>
-          <w:tcPr>
-            <w:tcW w:type="dxa" w:w="2645"/>
-          </w:tcPr>
-          <w:p>
-            <w:pPr>
-              <w:spacing w:after="0"/>
-              <w:jc w:val="left"/>
-            </w:pPr>
-            <w:r/>
-            <w:r>
-              <w:rPr>
-                <w:rFonts w:ascii="Georgia" w:hAnsi="Georgia"/>
-                <w:b w:val="0"/>
-                <w:i w:val="0"/>
-                <w:color w:val="262B35"/>
-                <w:sz w:val="16"/>
-              </w:rPr>
-              <w:t>Revenue per equity dollar</w:t>
-            </w:r>
-          </w:p>
-        </w:tc>
-        <w:tc>
-          <w:tcPr>
-            <w:tcW w:type="dxa" w:w="700"/>
-          </w:tcPr>
-          <w:p>
-            <w:pPr>
-              <w:spacing w:after="0"/>
-              <w:jc w:val="right"/>
-            </w:pPr>
-            <w:r/>
-            <w:r>
-              <w:rPr>
-                <w:rFonts w:ascii="Georgia" w:hAnsi="Georgia"/>
-                <w:b w:val="0"/>
-                <w:i w:val="0"/>
-                <w:color w:val="262B35"/>
-                <w:sz w:val="16"/>
-              </w:rPr>
-              <w:t>9.0</w:t>
-            </w:r>
-          </w:p>
-        </w:tc>
-        <w:tc>
-          <w:tcPr>
-            <w:tcW w:type="dxa" w:w="6104"/>
-          </w:tcPr>
-          <w:p>
-            <w:pPr>
-              <w:spacing w:after="0"/>
-              <w:jc w:val="left"/>
-            </w:pPr>
-            <w:r/>
-            <w:r>
-              <w:rPr>
-                <w:rFonts w:ascii="Georgia" w:hAnsi="Georgia"/>
-                <w:b w:val="0"/>
-                <w:i w:val="0"/>
-                <w:color w:val="262B35"/>
-                <w:sz w:val="16"/>
-              </w:rPr>
-              <w:t>0.34x run-rate per lifetime equity dollar ($6.9B / ~$20.2B), Jul 2026; best-in-cohort save Anthropic</w:t>
-            </w:r>
-          </w:p>
-        </w:tc>
-      </w:tr>
-      <w:tr>
-        <w:trPr>
-          <w:cantSplit/>
-        </w:trPr>
-        <w:tc>
-          <w:tcPr>
-            <w:tcW w:type="dxa" w:w="2645"/>
-            <w:shd w:val="clear" w:fill="F2F5F9"/>
-          </w:tcPr>
-          <w:p>
-            <w:pPr>
-              <w:spacing w:after="0"/>
-              <w:jc w:val="left"/>
-            </w:pPr>
-            <w:r/>
-            <w:r>
-              <w:rPr>
-                <w:rFonts w:ascii="Georgia" w:hAnsi="Georgia"/>
-                <w:b w:val="0"/>
-                <w:i w:val="0"/>
-                <w:color w:val="262B35"/>
-                <w:sz w:val="16"/>
-              </w:rPr>
-              <w:t>FCF status and trajectory</w:t>
-            </w:r>
-          </w:p>
-        </w:tc>
-        <w:tc>
-          <w:tcPr>
-            <w:tcW w:type="dxa" w:w="700"/>
-            <w:shd w:val="clear" w:fill="F2F5F9"/>
-          </w:tcPr>
-          <w:p>
-            <w:pPr>
-              <w:spacing w:after="0"/>
-              <w:jc w:val="right"/>
-            </w:pPr>
-            <w:r/>
-            <w:r>
-              <w:rPr>
-                <w:rFonts w:ascii="Georgia" w:hAnsi="Georgia"/>
-                <w:b w:val="0"/>
-                <w:i w:val="0"/>
-                <w:color w:val="262B35"/>
-                <w:sz w:val="16"/>
-              </w:rPr>
-              <w:t>9.1</w:t>
-            </w:r>
-          </w:p>
-        </w:tc>
-        <w:tc>
-          <w:tcPr>
-            <w:tcW w:type="dxa" w:w="6104"/>
-            <w:shd w:val="clear" w:fill="F2F5F9"/>
-          </w:tcPr>
-          <w:p>
-            <w:pPr>
-              <w:spacing w:after="0"/>
-              <w:jc w:val="left"/>
-            </w:pPr>
-            <w:r/>
-            <w:r>
-              <w:rPr>
-                <w:rFonts w:ascii="Georgia" w:hAnsi="Georgia"/>
-                <w:b w:val="0"/>
-                <w:i w:val="0"/>
-                <w:color w:val="262B35"/>
-                <w:sz w:val="16"/>
-              </w:rPr>
-              <w:t>FCF positive on TTM and FY2025 bases (company, Feb 9, 2026); the frontier labs are deeply FCF-negative</w:t>
-            </w:r>
-          </w:p>
-        </w:tc>
-      </w:tr>
-      <w:tr>
-        <w:trPr>
-          <w:cantSplit/>
-        </w:trPr>
-        <w:tc>
-          <w:tcPr>
-            <w:tcW w:type="dxa" w:w="2645"/>
-          </w:tcPr>
-          <w:p>
-            <w:pPr>
-              <w:spacing w:after="0"/>
-              <w:jc w:val="left"/>
-            </w:pPr>
-            <w:r/>
-            <w:r>
-              <w:rPr>
-                <w:rFonts w:ascii="Georgia" w:hAnsi="Georgia"/>
-                <w:b w:val="0"/>
-                <w:i w:val="0"/>
-                <w:color w:val="262B35"/>
-                <w:sz w:val="16"/>
-              </w:rPr>
-              <w:t>Cost of incremental growth</w:t>
-            </w:r>
-          </w:p>
-        </w:tc>
-        <w:tc>
-          <w:tcPr>
-            <w:tcW w:type="dxa" w:w="700"/>
-          </w:tcPr>
-          <w:p>
-            <w:pPr>
-              <w:spacing w:after="0"/>
-              <w:jc w:val="right"/>
-            </w:pPr>
-            <w:r/>
-            <w:r>
-              <w:rPr>
-                <w:rFonts w:ascii="Georgia" w:hAnsi="Georgia"/>
-                <w:b w:val="0"/>
-                <w:i w:val="0"/>
-                <w:color w:val="262B35"/>
-                <w:sz w:val="16"/>
-              </w:rPr>
-              <w:t>8.5</w:t>
-            </w:r>
-          </w:p>
-        </w:tc>
-        <w:tc>
-          <w:tcPr>
-            <w:tcW w:type="dxa" w:w="6104"/>
-          </w:tcPr>
-          <w:p>
-            <w:pPr>
-              <w:spacing w:after="0"/>
-              <w:jc w:val="left"/>
-            </w:pPr>
-            <w:r/>
-            <w:r>
-              <w:rPr>
-                <w:rFonts w:ascii="Georgia" w:hAnsi="Georgia"/>
-                <w:b w:val="0"/>
-                <w:i w:val="0"/>
-                <w:color w:val="262B35"/>
-                <w:sz w:val="16"/>
-              </w:rPr>
-              <w:t>Growth accelerating while the equity base is static since Feb 2026; agent-driven cost of revenue rising (company, Jun 16, 2026)</w:t>
-            </w:r>
-          </w:p>
-        </w:tc>
-      </w:tr>
-      <w:tr>
-        <w:trPr>
-          <w:cantSplit/>
-        </w:trPr>
-        <w:tc>
-          <w:tcPr>
-            <w:tcW w:type="dxa" w:w="2645"/>
-            <w:shd w:val="clear" w:fill="F2F5F9"/>
-          </w:tcPr>
-          <w:p>
-            <w:pPr>
-              <w:spacing w:after="0"/>
-              <w:jc w:val="left"/>
-            </w:pPr>
-            <w:r/>
-            <w:r>
-              <w:rPr>
-                <w:rFonts w:ascii="Georgia" w:hAnsi="Georgia"/>
-                <w:b w:val="0"/>
-                <w:i w:val="0"/>
-                <w:color w:val="262B35"/>
-                <w:sz w:val="16"/>
-              </w:rPr>
-              <w:t>Dilution discipline</w:t>
-            </w:r>
-          </w:p>
-        </w:tc>
-        <w:tc>
-          <w:tcPr>
-            <w:tcW w:type="dxa" w:w="700"/>
-            <w:shd w:val="clear" w:fill="F2F5F9"/>
-          </w:tcPr>
-          <w:p>
-            <w:pPr>
-              <w:spacing w:after="0"/>
-              <w:jc w:val="right"/>
-            </w:pPr>
-            <w:r/>
-            <w:r>
-              <w:rPr>
-                <w:rFonts w:ascii="Georgia" w:hAnsi="Georgia"/>
-                <w:b w:val="0"/>
-                <w:i w:val="0"/>
-                <w:color w:val="262B35"/>
-                <w:sz w:val="16"/>
-              </w:rPr>
-              <w:t>9.0</w:t>
-            </w:r>
-          </w:p>
-        </w:tc>
-        <w:tc>
-          <w:tcPr>
-            <w:tcW w:type="dxa" w:w="6104"/>
-            <w:shd w:val="clear" w:fill="F2F5F9"/>
-          </w:tcPr>
-          <w:p>
-            <w:pPr>
-              <w:spacing w:after="0"/>
-              <w:jc w:val="left"/>
-            </w:pPr>
-            <w:r/>
-            <w:r>
-              <w:rPr>
-                <w:rFonts w:ascii="Georgia" w:hAnsi="Georgia"/>
-                <w:b w:val="0"/>
-                <w:i w:val="0"/>
-                <w:color w:val="262B35"/>
-                <w:sz w:val="16"/>
-              </w:rPr>
-              <w:t>Mark held flat at $134B across two closes (Dec 2025, Feb 2026); raised for flexibility and liquidity, not survival</w:t>
-            </w:r>
-          </w:p>
-        </w:tc>
-      </w:tr>
-      <w:tr>
-        <w:trPr>
-          <w:cantSplit/>
-        </w:trPr>
-        <w:tc>
-          <w:tcPr>
-            <w:tcW w:type="dxa" w:w="2645"/>
-          </w:tcPr>
-          <w:p>
-            <w:pPr>
-              <w:spacing w:after="0"/>
-              <w:jc w:val="left"/>
-            </w:pPr>
-            <w:r/>
-            <w:r>
-              <w:rPr>
-                <w:rFonts w:ascii="Georgia" w:hAnsi="Georgia"/>
-                <w:b w:val="0"/>
-                <w:i w:val="0"/>
-                <w:color w:val="262B35"/>
-                <w:sz w:val="16"/>
-              </w:rPr>
-              <w:t>Stage-gate compliance (S5)</w:t>
-            </w:r>
-          </w:p>
-        </w:tc>
-        <w:tc>
-          <w:tcPr>
-            <w:tcW w:type="dxa" w:w="700"/>
-          </w:tcPr>
-          <w:p>
-            <w:pPr>
-              <w:spacing w:after="0"/>
-              <w:jc w:val="right"/>
-            </w:pPr>
-            <w:r/>
-            <w:r>
-              <w:rPr>
-                <w:rFonts w:ascii="Georgia" w:hAnsi="Georgia"/>
-                <w:b w:val="0"/>
-                <w:i w:val="0"/>
-                <w:color w:val="262B35"/>
-                <w:sz w:val="16"/>
-              </w:rPr>
-              <w:t>8.9</w:t>
-            </w:r>
-          </w:p>
-        </w:tc>
-        <w:tc>
-          <w:tcPr>
-            <w:tcW w:type="dxa" w:w="6104"/>
-          </w:tcPr>
-          <w:p>
-            <w:pPr>
-              <w:spacing w:after="0"/>
-              <w:jc w:val="left"/>
-            </w:pPr>
-            <w:r/>
-            <w:r>
-              <w:rPr>
-                <w:rFonts w:ascii="Georgia" w:hAnsi="Georgia"/>
-                <w:b w:val="0"/>
-                <w:i w:val="0"/>
-                <w:color w:val="262B35"/>
-                <w:sz w:val="16"/>
-              </w:rPr>
-              <w:t>Gate met on all three legs; margin cushion ~4 points and guided lower</w:t>
-            </w:r>
-          </w:p>
-        </w:tc>
-      </w:tr>
-    </w:tbl>
-    <w:p>
-      <w:pPr>
-        <w:spacing w:after="200"/>
-        <w:jc w:val="left"/>
-      </w:pPr>
-      <w:r>
-        <w:rPr>
-          <w:b w:val="0"/>
-          <w:i/>
-          <w:color w:val="6B7280"/>
-          <w:sz w:val="15"/>
-        </w:rPr>
-        <w:t>Simple average 8.9. Denominator is equity-only by AIBQ ruling; the ~$9.3B of debt is assessed under CI and in the risk register.</w:t>
+        <w:t>CE asks one question: how much durable revenue does a dollar of equity buy? Databricks converts roughly $20.2 billion of lifetime equity (PitchBook 21-deal record, July 2026) into $6.9 billion of run-rate revenue, 0.34x, the best in the cohort save Anthropic, and it is the only cohort member whose marginal growth requires no new equity at all because the business self-funds: free cash flow is positive on trailing-twelve-month and fiscal-2025 bases (company, February 9, 2026), and the equity base has been static since February 2026 while growth accelerated. The discipline shows in behavior as much as in ratios. The $134 billion mark was held flat across two closes rather than chased upward, and the last several raises funded employee liquidity and flexibility rather than operations; a company that raises because it wants to, not because it must, is exhibiting the capital character this dimension exists to measure. What keeps the score at 8.9 rather than higher is the gate: all three legs are met, but the margin leg is binding at 74% against the 70% floor, guided lower on agent-driven compute (company disclosure, June 16, 2026). That roughly four-point cushion is why the next quarterly print is the single most important data point in this report.</w:t>
       </w:r>
     </w:p>
     <w:p>
@@ -4237,501 +3743,7 @@
           <w:color w:val="262B35"/>
           <w:sz w:val="21"/>
         </w:rPr>
-        <w:t>RQ carries the framework's largest weight, and Databricks posts the strongest RQ this framework has scored. The core mechanism is structural rather than commercial: consumption billing on compute and storage means expansion is a property of customer workloads, not of sales-force heroics. Net revenue retention above 140% at a base of more than 20,000 organizations, with more than 800 customers above $1 million a year and more than 70 above $10 million (company, February 9, 2026), is a distribution of expansion, not a handful of whales. One honest flag: those operating metrics are five months old at publication; the September-October disclosure should refresh them.</w:t>
-      </w:r>
-    </w:p>
-    <w:p>
-      <w:pPr>
-        <w:keepNext/>
-        <w:spacing w:after="60"/>
-        <w:jc w:val="left"/>
-      </w:pPr>
-      <w:r>
-        <w:rPr>
-          <w:b/>
-          <w:i w:val="0"/>
-          <w:color w:val="1F2A44"/>
-          <w:sz w:val="19"/>
-        </w:rPr>
-        <w:t>RQ sub-scores (5)</w:t>
-      </w:r>
-    </w:p>
-    <w:tbl>
-      <w:tblPr>
-        <w:tblW w:type="dxa" w:w="9360"/>
-        <w:jc w:val="center"/>
-        <w:tblLayout w:type="fixed"/>
-        <w:tblLook w:firstColumn="1" w:firstRow="1" w:lastColumn="0" w:lastRow="0" w:noHBand="0" w:noVBand="1" w:val="04A0"/>
-        <w:tblBorders>
-          <w:top w:val="single" w:sz="4" w:space="0" w:color="C9D2DE"/>
-          <w:left w:val="single" w:sz="4" w:space="0" w:color="C9D2DE"/>
-          <w:bottom w:val="single" w:sz="4" w:space="0" w:color="C9D2DE"/>
-          <w:right w:val="single" w:sz="4" w:space="0" w:color="C9D2DE"/>
-          <w:insideH w:val="single" w:sz="4" w:space="0" w:color="C9D2DE"/>
-          <w:insideV w:val="single" w:sz="4" w:space="0" w:color="C9D2DE"/>
-        </w:tblBorders>
-        <w:tblCellMar>
-          <w:top w:w="40" w:type="dxa"/>
-          <w:left w:w="80" w:type="dxa"/>
-          <w:bottom w:w="40" w:type="dxa"/>
-          <w:right w:w="80" w:type="dxa"/>
-        </w:tblCellMar>
-      </w:tblPr>
-      <w:tblGrid>
-        <w:gridCol w:w="3120"/>
-        <w:gridCol w:w="3120"/>
-        <w:gridCol w:w="3120"/>
-      </w:tblGrid>
-      <w:tr>
-        <w:trPr>
-          <w:cantSplit/>
-          <w:tblHeader w:val="true"/>
-        </w:trPr>
-        <w:tc>
-          <w:tcPr>
-            <w:tcW w:type="dxa" w:w="3056"/>
-            <w:shd w:val="clear" w:fill="1F2A44"/>
-          </w:tcPr>
-          <w:p>
-            <w:pPr>
-              <w:spacing w:after="0"/>
-              <w:jc w:val="left"/>
-            </w:pPr>
-            <w:r/>
-            <w:r>
-              <w:rPr>
-                <w:rFonts w:ascii="Georgia" w:hAnsi="Georgia"/>
-                <w:b/>
-                <w:i w:val="0"/>
-                <w:color w:val="FFFFFF"/>
-                <w:sz w:val="17"/>
-              </w:rPr>
-              <w:t>Sub-score</w:t>
-            </w:r>
-          </w:p>
-        </w:tc>
-        <w:tc>
-          <w:tcPr>
-            <w:tcW w:type="dxa" w:w="700"/>
-            <w:shd w:val="clear" w:fill="1F2A44"/>
-          </w:tcPr>
-          <w:p>
-            <w:pPr>
-              <w:spacing w:after="0"/>
-              <w:jc w:val="right"/>
-            </w:pPr>
-            <w:r/>
-            <w:r>
-              <w:rPr>
-                <w:rFonts w:ascii="Georgia" w:hAnsi="Georgia"/>
-                <w:b/>
-                <w:i w:val="0"/>
-                <w:color w:val="FFFFFF"/>
-                <w:sz w:val="17"/>
-              </w:rPr>
-              <w:t>Score</w:t>
-            </w:r>
-          </w:p>
-        </w:tc>
-        <w:tc>
-          <w:tcPr>
-            <w:tcW w:type="dxa" w:w="5730"/>
-            <w:shd w:val="clear" w:fill="1F2A44"/>
-          </w:tcPr>
-          <w:p>
-            <w:pPr>
-              <w:spacing w:after="0"/>
-              <w:jc w:val="left"/>
-            </w:pPr>
-            <w:r/>
-            <w:r>
-              <w:rPr>
-                <w:rFonts w:ascii="Georgia" w:hAnsi="Georgia"/>
-                <w:b/>
-                <w:i w:val="0"/>
-                <w:color w:val="FFFFFF"/>
-                <w:sz w:val="17"/>
-              </w:rPr>
-              <w:t>Basis (dated)</w:t>
-            </w:r>
-          </w:p>
-        </w:tc>
-      </w:tr>
-      <w:tr>
-        <w:trPr>
-          <w:cantSplit/>
-        </w:trPr>
-        <w:tc>
-          <w:tcPr>
-            <w:tcW w:type="dxa" w:w="3056"/>
-          </w:tcPr>
-          <w:p>
-            <w:pPr>
-              <w:spacing w:after="0"/>
-              <w:jc w:val="left"/>
-            </w:pPr>
-            <w:r/>
-            <w:r>
-              <w:rPr>
-                <w:rFonts w:ascii="Georgia" w:hAnsi="Georgia"/>
-                <w:b w:val="0"/>
-                <w:i w:val="0"/>
-                <w:color w:val="262B35"/>
-                <w:sz w:val="16"/>
-              </w:rPr>
-              <w:t>Net revenue retention</w:t>
-            </w:r>
-          </w:p>
-        </w:tc>
-        <w:tc>
-          <w:tcPr>
-            <w:tcW w:type="dxa" w:w="700"/>
-          </w:tcPr>
-          <w:p>
-            <w:pPr>
-              <w:spacing w:after="0"/>
-              <w:jc w:val="right"/>
-            </w:pPr>
-            <w:r/>
-            <w:r>
-              <w:rPr>
-                <w:rFonts w:ascii="Georgia" w:hAnsi="Georgia"/>
-                <w:b w:val="0"/>
-                <w:i w:val="0"/>
-                <w:color w:val="262B35"/>
-                <w:sz w:val="16"/>
-              </w:rPr>
-              <w:t>9.4</w:t>
-            </w:r>
-          </w:p>
-        </w:tc>
-        <w:tc>
-          <w:tcPr>
-            <w:tcW w:type="dxa" w:w="5730"/>
-          </w:tcPr>
-          <w:p>
-            <w:pPr>
-              <w:spacing w:after="0"/>
-              <w:jc w:val="left"/>
-            </w:pPr>
-            <w:r/>
-            <w:r>
-              <w:rPr>
-                <w:rFonts w:ascii="Georgia" w:hAnsi="Georgia"/>
-                <w:b w:val="0"/>
-                <w:i w:val="0"/>
-                <w:color w:val="262B35"/>
-                <w:sz w:val="16"/>
-              </w:rPr>
-              <w:t>&gt;140% (company, Feb 9, 2026); top decile at this scale, and mechanical under consumption billing</w:t>
-            </w:r>
-          </w:p>
-        </w:tc>
-      </w:tr>
-      <w:tr>
-        <w:trPr>
-          <w:cantSplit/>
-        </w:trPr>
-        <w:tc>
-          <w:tcPr>
-            <w:tcW w:type="dxa" w:w="3056"/>
-            <w:shd w:val="clear" w:fill="F2F5F9"/>
-          </w:tcPr>
-          <w:p>
-            <w:pPr>
-              <w:spacing w:after="0"/>
-              <w:jc w:val="left"/>
-            </w:pPr>
-            <w:r/>
-            <w:r>
-              <w:rPr>
-                <w:rFonts w:ascii="Georgia" w:hAnsi="Georgia"/>
-                <w:b w:val="0"/>
-                <w:i w:val="0"/>
-                <w:color w:val="262B35"/>
-                <w:sz w:val="16"/>
-              </w:rPr>
-              <w:t>Billing-model quality</w:t>
-            </w:r>
-          </w:p>
-        </w:tc>
-        <w:tc>
-          <w:tcPr>
-            <w:tcW w:type="dxa" w:w="700"/>
-            <w:shd w:val="clear" w:fill="F2F5F9"/>
-          </w:tcPr>
-          <w:p>
-            <w:pPr>
-              <w:spacing w:after="0"/>
-              <w:jc w:val="right"/>
-            </w:pPr>
-            <w:r/>
-            <w:r>
-              <w:rPr>
-                <w:rFonts w:ascii="Georgia" w:hAnsi="Georgia"/>
-                <w:b w:val="0"/>
-                <w:i w:val="0"/>
-                <w:color w:val="262B35"/>
-                <w:sz w:val="16"/>
-              </w:rPr>
-              <w:t>9.2</w:t>
-            </w:r>
-          </w:p>
-        </w:tc>
-        <w:tc>
-          <w:tcPr>
-            <w:tcW w:type="dxa" w:w="5730"/>
-            <w:shd w:val="clear" w:fill="F2F5F9"/>
-          </w:tcPr>
-          <w:p>
-            <w:pPr>
-              <w:spacing w:after="0"/>
-              <w:jc w:val="left"/>
-            </w:pPr>
-            <w:r/>
-            <w:r>
-              <w:rPr>
-                <w:rFonts w:ascii="Georgia" w:hAnsi="Georgia"/>
-                <w:b w:val="0"/>
-                <w:i w:val="0"/>
-                <w:color w:val="262B35"/>
-                <w:sz w:val="16"/>
-              </w:rPr>
-              <w:t>Consumption-based on compute and storage; expansion is a product property, not a sales artifact</w:t>
-            </w:r>
-          </w:p>
-        </w:tc>
-      </w:tr>
-      <w:tr>
-        <w:trPr>
-          <w:cantSplit/>
-        </w:trPr>
-        <w:tc>
-          <w:tcPr>
-            <w:tcW w:type="dxa" w:w="3056"/>
-          </w:tcPr>
-          <w:p>
-            <w:pPr>
-              <w:spacing w:after="0"/>
-              <w:jc w:val="left"/>
-            </w:pPr>
-            <w:r/>
-            <w:r>
-              <w:rPr>
-                <w:rFonts w:ascii="Georgia" w:hAnsi="Georgia"/>
-                <w:b w:val="0"/>
-                <w:i w:val="0"/>
-                <w:color w:val="262B35"/>
-                <w:sz w:val="16"/>
-              </w:rPr>
-              <w:t>Customer diversification</w:t>
-            </w:r>
-          </w:p>
-        </w:tc>
-        <w:tc>
-          <w:tcPr>
-            <w:tcW w:type="dxa" w:w="700"/>
-          </w:tcPr>
-          <w:p>
-            <w:pPr>
-              <w:spacing w:after="0"/>
-              <w:jc w:val="right"/>
-            </w:pPr>
-            <w:r/>
-            <w:r>
-              <w:rPr>
-                <w:rFonts w:ascii="Georgia" w:hAnsi="Georgia"/>
-                <w:b w:val="0"/>
-                <w:i w:val="0"/>
-                <w:color w:val="262B35"/>
-                <w:sz w:val="16"/>
-              </w:rPr>
-              <w:t>8.7</w:t>
-            </w:r>
-          </w:p>
-        </w:tc>
-        <w:tc>
-          <w:tcPr>
-            <w:tcW w:type="dxa" w:w="5730"/>
-          </w:tcPr>
-          <w:p>
-            <w:pPr>
-              <w:spacing w:after="0"/>
-              <w:jc w:val="left"/>
-            </w:pPr>
-            <w:r/>
-            <w:r>
-              <w:rPr>
-                <w:rFonts w:ascii="Georgia" w:hAnsi="Georgia"/>
-                <w:b w:val="0"/>
-                <w:i w:val="0"/>
-                <w:color w:val="262B35"/>
-                <w:sz w:val="16"/>
-              </w:rPr>
-              <w:t>&gt;20,000 organizations; &gt;60% of the Fortune 500; 800+ at $1M+, 70+ at $10M+ (company, Feb 9, 2026)</w:t>
-            </w:r>
-          </w:p>
-        </w:tc>
-      </w:tr>
-      <w:tr>
-        <w:trPr>
-          <w:cantSplit/>
-        </w:trPr>
-        <w:tc>
-          <w:tcPr>
-            <w:tcW w:type="dxa" w:w="3056"/>
-            <w:shd w:val="clear" w:fill="F2F5F9"/>
-          </w:tcPr>
-          <w:p>
-            <w:pPr>
-              <w:spacing w:after="0"/>
-              <w:jc w:val="left"/>
-            </w:pPr>
-            <w:r/>
-            <w:r>
-              <w:rPr>
-                <w:rFonts w:ascii="Georgia" w:hAnsi="Georgia"/>
-                <w:b w:val="0"/>
-                <w:i w:val="0"/>
-                <w:color w:val="262B35"/>
-                <w:sz w:val="16"/>
-              </w:rPr>
-              <w:t>Scale-adjusted growth durability</w:t>
-            </w:r>
-          </w:p>
-        </w:tc>
-        <w:tc>
-          <w:tcPr>
-            <w:tcW w:type="dxa" w:w="700"/>
-            <w:shd w:val="clear" w:fill="F2F5F9"/>
-          </w:tcPr>
-          <w:p>
-            <w:pPr>
-              <w:spacing w:after="0"/>
-              <w:jc w:val="right"/>
-            </w:pPr>
-            <w:r/>
-            <w:r>
-              <w:rPr>
-                <w:rFonts w:ascii="Georgia" w:hAnsi="Georgia"/>
-                <w:b w:val="0"/>
-                <w:i w:val="0"/>
-                <w:color w:val="262B35"/>
-                <w:sz w:val="16"/>
-              </w:rPr>
-              <w:t>9.3</w:t>
-            </w:r>
-          </w:p>
-        </w:tc>
-        <w:tc>
-          <w:tcPr>
-            <w:tcW w:type="dxa" w:w="5730"/>
-            <w:shd w:val="clear" w:fill="F2F5F9"/>
-          </w:tcPr>
-          <w:p>
-            <w:pPr>
-              <w:spacing w:after="0"/>
-              <w:jc w:val="left"/>
-            </w:pPr>
-            <w:r/>
-            <w:r>
-              <w:rPr>
-                <w:rFonts w:ascii="Georgia" w:hAnsi="Georgia"/>
-                <w:b w:val="0"/>
-                <w:i w:val="0"/>
-                <w:color w:val="262B35"/>
-                <w:sz w:val="16"/>
-              </w:rPr>
-              <w:t>+80% at $6.9B, accelerating across four consecutive prints (company, Sep 2025 to Jun 2026)</w:t>
-            </w:r>
-          </w:p>
-        </w:tc>
-      </w:tr>
-      <w:tr>
-        <w:trPr>
-          <w:cantSplit/>
-        </w:trPr>
-        <w:tc>
-          <w:tcPr>
-            <w:tcW w:type="dxa" w:w="3056"/>
-          </w:tcPr>
-          <w:p>
-            <w:pPr>
-              <w:spacing w:after="0"/>
-              <w:jc w:val="left"/>
-            </w:pPr>
-            <w:r/>
-            <w:r>
-              <w:rPr>
-                <w:rFonts w:ascii="Georgia" w:hAnsi="Georgia"/>
-                <w:b w:val="0"/>
-                <w:i w:val="0"/>
-                <w:color w:val="262B35"/>
-                <w:sz w:val="16"/>
-              </w:rPr>
-              <w:t>Mix genuineness</w:t>
-            </w:r>
-          </w:p>
-        </w:tc>
-        <w:tc>
-          <w:tcPr>
-            <w:tcW w:type="dxa" w:w="700"/>
-          </w:tcPr>
-          <w:p>
-            <w:pPr>
-              <w:spacing w:after="0"/>
-              <w:jc w:val="right"/>
-            </w:pPr>
-            <w:r/>
-            <w:r>
-              <w:rPr>
-                <w:rFonts w:ascii="Georgia" w:hAnsi="Georgia"/>
-                <w:b w:val="0"/>
-                <w:i w:val="0"/>
-                <w:color w:val="262B35"/>
-                <w:sz w:val="16"/>
-              </w:rPr>
-              <w:t>8.4</w:t>
-            </w:r>
-          </w:p>
-        </w:tc>
-        <w:tc>
-          <w:tcPr>
-            <w:tcW w:type="dxa" w:w="5730"/>
-          </w:tcPr>
-          <w:p>
-            <w:pPr>
-              <w:spacing w:after="0"/>
-              <w:jc w:val="left"/>
-            </w:pPr>
-            <w:r/>
-            <w:r>
-              <w:rPr>
-                <w:rFonts w:ascii="Georgia" w:hAnsi="Georgia"/>
-                <w:b w:val="0"/>
-                <w:i w:val="0"/>
-                <w:color w:val="262B35"/>
-                <w:sz w:val="16"/>
-              </w:rPr>
-              <w:t>AI line ($1.7B) is incremental usage on the same platform, not relabeled core; agent-driven usage is young (Jun 16, 2026)</w:t>
-            </w:r>
-          </w:p>
-        </w:tc>
-      </w:tr>
-    </w:tbl>
-    <w:p>
-      <w:pPr>
-        <w:spacing w:after="200"/>
-        <w:jc w:val="left"/>
-      </w:pPr>
-      <w:r>
-        <w:rPr>
-          <w:b w:val="0"/>
-          <w:i/>
-          <w:color w:val="6B7280"/>
-          <w:sz w:val="15"/>
-        </w:rPr>
-        <w:t>Simple average 9.0. Consumption revenue is lower-visibility than subscription in downturns; that risk is scored inside mix genuineness and durability.</w:t>
+        <w:t>RQ carries the framework's largest weight, and Databricks posts the strongest RQ this framework has scored. The core mechanism is structural rather than commercial: consumption billing on compute and storage means expansion is a property of customer workloads, not of sales-force heroics, and net revenue retention above 140% is therefore mechanical rather than heroic. The base beneath that retention is a distribution, not a dependency: more than 20,000 organizations, over 60% of the Fortune 500, more than 800 customers above $1 million a year and more than 70 above $10 million (company, February 9, 2026). Growth is not merely fast but accelerating across four consecutive dated prints, +50% to +80% between September 2025 and June 2026, at a scale where software companies normally decelerate. And the mix is honestly attributed: the $1.7 billion AI line is incremental usage metered on the same platform, not relabeled core revenue. Two honest flags keep the score at 9.0 rather than higher: consumption revenue carries less downturn visibility than subscriptions, because usage can throttle without a contract breach, and the operating metrics above are five months old at publication; the September-October disclosure should refresh them.</w:t>
       </w:r>
     </w:p>
     <w:p>
@@ -4754,430 +3766,7 @@
           <w:color w:val="262B35"/>
           <w:sz w:val="21"/>
         </w:rPr>
-        <w:t>CI is the honest notch in the radar (Figure 1) and the dimension a skeptic should attack first. Databricks owns no hyperscale infrastructure: it rides AWS, Azure, and Google Cloud, pays their economics, and competes with their first-party analytics while depending on their capacity. Three mitigants hold the score at 8.0. First, multi-cloud portability is real at Databricks in a way it is not for most vendors, which converts three suppliers into bidders. Second, the debt structure exists substantially to pre-fund compute commitments without burning equity, a deliberate hedge credited here rather than in CE. Third, the MosaicML lineage gives the company genuine training and serving engineering of its own, so AI unit economics are not purely a pass-through of someone else's GPU pricing. The offset is visible in the P&amp;L: agents generating queries at machine speed is revenue, but at 74% and falling gross margin it is also proof that compute cost is a live constraint.</w:t>
-      </w:r>
-    </w:p>
-    <w:p>
-      <w:pPr>
-        <w:keepNext/>
-        <w:spacing w:after="60"/>
-        <w:jc w:val="left"/>
-      </w:pPr>
-      <w:r>
-        <w:rPr>
-          <w:b/>
-          <w:i w:val="0"/>
-          <w:color w:val="1F2A44"/>
-          <w:sz w:val="19"/>
-        </w:rPr>
-        <w:t>CI sub-scores (4)</w:t>
-      </w:r>
-    </w:p>
-    <w:tbl>
-      <w:tblPr>
-        <w:tblW w:type="dxa" w:w="9360"/>
-        <w:jc w:val="center"/>
-        <w:tblLayout w:type="fixed"/>
-        <w:tblLook w:firstColumn="1" w:firstRow="1" w:lastColumn="0" w:lastRow="0" w:noHBand="0" w:noVBand="1" w:val="04A0"/>
-        <w:tblBorders>
-          <w:top w:val="single" w:sz="4" w:space="0" w:color="C9D2DE"/>
-          <w:left w:val="single" w:sz="4" w:space="0" w:color="C9D2DE"/>
-          <w:bottom w:val="single" w:sz="4" w:space="0" w:color="C9D2DE"/>
-          <w:right w:val="single" w:sz="4" w:space="0" w:color="C9D2DE"/>
-          <w:insideH w:val="single" w:sz="4" w:space="0" w:color="C9D2DE"/>
-          <w:insideV w:val="single" w:sz="4" w:space="0" w:color="C9D2DE"/>
-        </w:tblBorders>
-        <w:tblCellMar>
-          <w:top w:w="40" w:type="dxa"/>
-          <w:left w:w="80" w:type="dxa"/>
-          <w:bottom w:w="40" w:type="dxa"/>
-          <w:right w:w="80" w:type="dxa"/>
-        </w:tblCellMar>
-      </w:tblPr>
-      <w:tblGrid>
-        <w:gridCol w:w="3120"/>
-        <w:gridCol w:w="3120"/>
-        <w:gridCol w:w="3120"/>
-      </w:tblGrid>
-      <w:tr>
-        <w:trPr>
-          <w:cantSplit/>
-          <w:tblHeader w:val="true"/>
-        </w:trPr>
-        <w:tc>
-          <w:tcPr>
-            <w:tcW w:type="dxa" w:w="3362"/>
-            <w:shd w:val="clear" w:fill="1F2A44"/>
-          </w:tcPr>
-          <w:p>
-            <w:pPr>
-              <w:spacing w:after="0"/>
-              <w:jc w:val="left"/>
-            </w:pPr>
-            <w:r/>
-            <w:r>
-              <w:rPr>
-                <w:rFonts w:ascii="Georgia" w:hAnsi="Georgia"/>
-                <w:b/>
-                <w:i w:val="0"/>
-                <w:color w:val="FFFFFF"/>
-                <w:sz w:val="17"/>
-              </w:rPr>
-              <w:t>Sub-score</w:t>
-            </w:r>
-          </w:p>
-        </w:tc>
-        <w:tc>
-          <w:tcPr>
-            <w:tcW w:type="dxa" w:w="700"/>
-            <w:shd w:val="clear" w:fill="1F2A44"/>
-          </w:tcPr>
-          <w:p>
-            <w:pPr>
-              <w:spacing w:after="0"/>
-              <w:jc w:val="right"/>
-            </w:pPr>
-            <w:r/>
-            <w:r>
-              <w:rPr>
-                <w:rFonts w:ascii="Georgia" w:hAnsi="Georgia"/>
-                <w:b/>
-                <w:i w:val="0"/>
-                <w:color w:val="FFFFFF"/>
-                <w:sz w:val="17"/>
-              </w:rPr>
-              <w:t>Score</w:t>
-            </w:r>
-          </w:p>
-        </w:tc>
-        <w:tc>
-          <w:tcPr>
-            <w:tcW w:type="dxa" w:w="5452"/>
-            <w:shd w:val="clear" w:fill="1F2A44"/>
-          </w:tcPr>
-          <w:p>
-            <w:pPr>
-              <w:spacing w:after="0"/>
-              <w:jc w:val="left"/>
-            </w:pPr>
-            <w:r/>
-            <w:r>
-              <w:rPr>
-                <w:rFonts w:ascii="Georgia" w:hAnsi="Georgia"/>
-                <w:b/>
-                <w:i w:val="0"/>
-                <w:color w:val="FFFFFF"/>
-                <w:sz w:val="17"/>
-              </w:rPr>
-              <w:t>Basis (dated)</w:t>
-            </w:r>
-          </w:p>
-        </w:tc>
-      </w:tr>
-      <w:tr>
-        <w:trPr>
-          <w:cantSplit/>
-        </w:trPr>
-        <w:tc>
-          <w:tcPr>
-            <w:tcW w:type="dxa" w:w="3362"/>
-          </w:tcPr>
-          <w:p>
-            <w:pPr>
-              <w:spacing w:after="0"/>
-              <w:jc w:val="left"/>
-            </w:pPr>
-            <w:r/>
-            <w:r>
-              <w:rPr>
-                <w:rFonts w:ascii="Georgia" w:hAnsi="Georgia"/>
-                <w:b w:val="0"/>
-                <w:i w:val="0"/>
-                <w:color w:val="262B35"/>
-                <w:sz w:val="16"/>
-              </w:rPr>
-              <w:t>Infrastructure ownership and leverage</w:t>
-            </w:r>
-          </w:p>
-        </w:tc>
-        <w:tc>
-          <w:tcPr>
-            <w:tcW w:type="dxa" w:w="700"/>
-          </w:tcPr>
-          <w:p>
-            <w:pPr>
-              <w:spacing w:after="0"/>
-              <w:jc w:val="right"/>
-            </w:pPr>
-            <w:r/>
-            <w:r>
-              <w:rPr>
-                <w:rFonts w:ascii="Georgia" w:hAnsi="Georgia"/>
-                <w:b w:val="0"/>
-                <w:i w:val="0"/>
-                <w:color w:val="262B35"/>
-                <w:sz w:val="16"/>
-              </w:rPr>
-              <w:t>7.2</w:t>
-            </w:r>
-          </w:p>
-        </w:tc>
-        <w:tc>
-          <w:tcPr>
-            <w:tcW w:type="dxa" w:w="5452"/>
-          </w:tcPr>
-          <w:p>
-            <w:pPr>
-              <w:spacing w:after="0"/>
-              <w:jc w:val="left"/>
-            </w:pPr>
-            <w:r/>
-            <w:r>
-              <w:rPr>
-                <w:rFonts w:ascii="Georgia" w:hAnsi="Georgia"/>
-                <w:b w:val="0"/>
-                <w:i w:val="0"/>
-                <w:color w:val="262B35"/>
-                <w:sz w:val="16"/>
-              </w:rPr>
-              <w:t>No owned hyperscale capacity; rents from three competitor-suppliers</w:t>
-            </w:r>
-          </w:p>
-        </w:tc>
-      </w:tr>
-      <w:tr>
-        <w:trPr>
-          <w:cantSplit/>
-        </w:trPr>
-        <w:tc>
-          <w:tcPr>
-            <w:tcW w:type="dxa" w:w="3362"/>
-            <w:shd w:val="clear" w:fill="F2F5F9"/>
-          </w:tcPr>
-          <w:p>
-            <w:pPr>
-              <w:spacing w:after="0"/>
-              <w:jc w:val="left"/>
-            </w:pPr>
-            <w:r/>
-            <w:r>
-              <w:rPr>
-                <w:rFonts w:ascii="Georgia" w:hAnsi="Georgia"/>
-                <w:b w:val="0"/>
-                <w:i w:val="0"/>
-                <w:color w:val="262B35"/>
-                <w:sz w:val="16"/>
-              </w:rPr>
-              <w:t>Supplier diversification</w:t>
-            </w:r>
-          </w:p>
-        </w:tc>
-        <w:tc>
-          <w:tcPr>
-            <w:tcW w:type="dxa" w:w="700"/>
-            <w:shd w:val="clear" w:fill="F2F5F9"/>
-          </w:tcPr>
-          <w:p>
-            <w:pPr>
-              <w:spacing w:after="0"/>
-              <w:jc w:val="right"/>
-            </w:pPr>
-            <w:r/>
-            <w:r>
-              <w:rPr>
-                <w:rFonts w:ascii="Georgia" w:hAnsi="Georgia"/>
-                <w:b w:val="0"/>
-                <w:i w:val="0"/>
-                <w:color w:val="262B35"/>
-                <w:sz w:val="16"/>
-              </w:rPr>
-              <w:t>8.8</w:t>
-            </w:r>
-          </w:p>
-        </w:tc>
-        <w:tc>
-          <w:tcPr>
-            <w:tcW w:type="dxa" w:w="5452"/>
-            <w:shd w:val="clear" w:fill="F2F5F9"/>
-          </w:tcPr>
-          <w:p>
-            <w:pPr>
-              <w:spacing w:after="0"/>
-              <w:jc w:val="left"/>
-            </w:pPr>
-            <w:r/>
-            <w:r>
-              <w:rPr>
-                <w:rFonts w:ascii="Georgia" w:hAnsi="Georgia"/>
-                <w:b w:val="0"/>
-                <w:i w:val="0"/>
-                <w:color w:val="262B35"/>
-                <w:sz w:val="16"/>
-              </w:rPr>
-              <w:t>True workload portability across AWS, Azure, and GCP turns dependence into a bid process</w:t>
-            </w:r>
-          </w:p>
-        </w:tc>
-      </w:tr>
-      <w:tr>
-        <w:trPr>
-          <w:cantSplit/>
-        </w:trPr>
-        <w:tc>
-          <w:tcPr>
-            <w:tcW w:type="dxa" w:w="3362"/>
-          </w:tcPr>
-          <w:p>
-            <w:pPr>
-              <w:spacing w:after="0"/>
-              <w:jc w:val="left"/>
-            </w:pPr>
-            <w:r/>
-            <w:r>
-              <w:rPr>
-                <w:rFonts w:ascii="Georgia" w:hAnsi="Georgia"/>
-                <w:b w:val="0"/>
-                <w:i w:val="0"/>
-                <w:color w:val="262B35"/>
-                <w:sz w:val="16"/>
-              </w:rPr>
-              <w:t>Unit-cost trajectory</w:t>
-            </w:r>
-          </w:p>
-        </w:tc>
-        <w:tc>
-          <w:tcPr>
-            <w:tcW w:type="dxa" w:w="700"/>
-          </w:tcPr>
-          <w:p>
-            <w:pPr>
-              <w:spacing w:after="0"/>
-              <w:jc w:val="right"/>
-            </w:pPr>
-            <w:r/>
-            <w:r>
-              <w:rPr>
-                <w:rFonts w:ascii="Georgia" w:hAnsi="Georgia"/>
-                <w:b w:val="0"/>
-                <w:i w:val="0"/>
-                <w:color w:val="262B35"/>
-                <w:sz w:val="16"/>
-              </w:rPr>
-              <w:t>7.4</w:t>
-            </w:r>
-          </w:p>
-        </w:tc>
-        <w:tc>
-          <w:tcPr>
-            <w:tcW w:type="dxa" w:w="5452"/>
-          </w:tcPr>
-          <w:p>
-            <w:pPr>
-              <w:spacing w:after="0"/>
-              <w:jc w:val="left"/>
-            </w:pPr>
-            <w:r/>
-            <w:r>
-              <w:rPr>
-                <w:rFonts w:ascii="Georgia" w:hAnsi="Georgia"/>
-                <w:b w:val="0"/>
-                <w:i w:val="0"/>
-                <w:color w:val="262B35"/>
-                <w:sz w:val="16"/>
-              </w:rPr>
-              <w:t>Gross margin 74%, down from &gt;80%, guided lower on agentic compute (company, Jun 16, 2026)</w:t>
-            </w:r>
-          </w:p>
-        </w:tc>
-      </w:tr>
-      <w:tr>
-        <w:trPr>
-          <w:cantSplit/>
-        </w:trPr>
-        <w:tc>
-          <w:tcPr>
-            <w:tcW w:type="dxa" w:w="3362"/>
-            <w:shd w:val="clear" w:fill="F2F5F9"/>
-          </w:tcPr>
-          <w:p>
-            <w:pPr>
-              <w:spacing w:after="0"/>
-              <w:jc w:val="left"/>
-            </w:pPr>
-            <w:r/>
-            <w:r>
-              <w:rPr>
-                <w:rFonts w:ascii="Georgia" w:hAnsi="Georgia"/>
-                <w:b w:val="0"/>
-                <w:i w:val="0"/>
-                <w:color w:val="262B35"/>
-                <w:sz w:val="16"/>
-              </w:rPr>
-              <w:t>Strategic hedges</w:t>
-            </w:r>
-          </w:p>
-        </w:tc>
-        <w:tc>
-          <w:tcPr>
-            <w:tcW w:type="dxa" w:w="700"/>
-            <w:shd w:val="clear" w:fill="F2F5F9"/>
-          </w:tcPr>
-          <w:p>
-            <w:pPr>
-              <w:spacing w:after="0"/>
-              <w:jc w:val="right"/>
-            </w:pPr>
-            <w:r/>
-            <w:r>
-              <w:rPr>
-                <w:rFonts w:ascii="Georgia" w:hAnsi="Georgia"/>
-                <w:b w:val="0"/>
-                <w:i w:val="0"/>
-                <w:color w:val="262B35"/>
-                <w:sz w:val="16"/>
-              </w:rPr>
-              <w:t>8.6</w:t>
-            </w:r>
-          </w:p>
-        </w:tc>
-        <w:tc>
-          <w:tcPr>
-            <w:tcW w:type="dxa" w:w="5452"/>
-            <w:shd w:val="clear" w:fill="F2F5F9"/>
-          </w:tcPr>
-          <w:p>
-            <w:pPr>
-              <w:spacing w:after="0"/>
-              <w:jc w:val="left"/>
-            </w:pPr>
-            <w:r/>
-            <w:r>
-              <w:rPr>
-                <w:rFonts w:ascii="Georgia" w:hAnsi="Georgia"/>
-                <w:b w:val="0"/>
-                <w:i w:val="0"/>
-                <w:color w:val="262B35"/>
-                <w:sz w:val="16"/>
-              </w:rPr>
-              <w:t>~$9.3B debt capacity ring-fenced for compute (PitchBook, Jan 2025 to Feb 2026); Mosaic-derived serving efficiency; stake in the departed AI chief's hardware venture (Sep 2025)</w:t>
-            </w:r>
-          </w:p>
-        </w:tc>
-      </w:tr>
-    </w:tbl>
-    <w:p>
-      <w:pPr>
-        <w:spacing w:after="200"/>
-        <w:jc w:val="left"/>
-      </w:pPr>
-      <w:r>
-        <w:rPr>
-          <w:b w:val="0"/>
-          <w:i/>
-          <w:color w:val="6B7280"/>
-          <w:sz w:val="15"/>
-        </w:rPr>
-        <w:t>Simple average 8.0. The CI-CE boundary is where the debt lives: it does not dilute the CE denominator, but it is scored here as both hedge and obligation.</w:t>
+        <w:t>CI is the honest notch in the radar (Figure 1) and the dimension a skeptic should attack first. Databricks owns no hyperscale infrastructure: it rides AWS, Azure, and Google Cloud, pays their economics, and competes with their first-party analytics while depending on their capacity. Three mitigants hold the score at 8.0 rather than lower. First, multi-cloud portability is real at Databricks in a way it is not for most vendors; when workloads can move across three clouds, three suppliers become three bidders. Second, the roughly $9.3 billion debt structure assembled between January 2025 and February 2026 (PitchBook deal records) exists substantially to pre-fund compute commitments without burning equity, a deliberate hedge credited here rather than in CE, and carried simultaneously as an obligation in the risk register. Third, the MosaicML lineage gives the company genuine training and serving engineering of its own, so AI unit economics are not purely a pass-through of someone else's GPU pricing. The offset is visible in the P&amp;L and is why this dimension cannot score a 9: agents generating queries at machine speed is revenue, but at 74% and falling gross margin it is also proof that compute cost is a live constraint on the business.</w:t>
       </w:r>
     </w:p>
     <w:p>
@@ -5200,501 +3789,7 @@
           <w:color w:val="262B35"/>
           <w:sz w:val="21"/>
         </w:rPr>
-        <w:t>GO measures whether the company can access public markets on its own timetable, and whether its governance would survive the scrutiny when it does. Databricks scores 8.9, down from an effective 9.4: the 0.5-point imminence premium tied to a second-half-2026 filing has been removed, because no S-1 is on file (SEC EDGAR, CIK 1587468, verified July 10, 2026; Form D filings only) and the chief executive has publicly ruled 2026 out. What remains is still exceptional: a public-company disclosure cadence while private (four dated financial prints in ten months with consistent metric definitions), a crossover-heavy investor register that already resembles a public one, and, critically, the luxury of choosing the window. Waiting is a governance strength when free cash flow means the company never has to file into a bad market.</w:t>
-      </w:r>
-    </w:p>
-    <w:p>
-      <w:pPr>
-        <w:keepNext/>
-        <w:spacing w:after="60"/>
-        <w:jc w:val="left"/>
-      </w:pPr>
-      <w:r>
-        <w:rPr>
-          <w:b/>
-          <w:i w:val="0"/>
-          <w:color w:val="1F2A44"/>
-          <w:sz w:val="19"/>
-        </w:rPr>
-        <w:t>GO sub-scores (5)</w:t>
-      </w:r>
-    </w:p>
-    <w:tbl>
-      <w:tblPr>
-        <w:tblW w:type="dxa" w:w="9360"/>
-        <w:jc w:val="center"/>
-        <w:tblLayout w:type="fixed"/>
-        <w:tblLook w:firstColumn="1" w:firstRow="1" w:lastColumn="0" w:lastRow="0" w:noHBand="0" w:noVBand="1" w:val="04A0"/>
-        <w:tblBorders>
-          <w:top w:val="single" w:sz="4" w:space="0" w:color="C9D2DE"/>
-          <w:left w:val="single" w:sz="4" w:space="0" w:color="C9D2DE"/>
-          <w:bottom w:val="single" w:sz="4" w:space="0" w:color="C9D2DE"/>
-          <w:right w:val="single" w:sz="4" w:space="0" w:color="C9D2DE"/>
-          <w:insideH w:val="single" w:sz="4" w:space="0" w:color="C9D2DE"/>
-          <w:insideV w:val="single" w:sz="4" w:space="0" w:color="C9D2DE"/>
-        </w:tblBorders>
-        <w:tblCellMar>
-          <w:top w:w="40" w:type="dxa"/>
-          <w:left w:w="80" w:type="dxa"/>
-          <w:bottom w:w="40" w:type="dxa"/>
-          <w:right w:w="80" w:type="dxa"/>
-        </w:tblCellMar>
-      </w:tblPr>
-      <w:tblGrid>
-        <w:gridCol w:w="3120"/>
-        <w:gridCol w:w="3120"/>
-        <w:gridCol w:w="3120"/>
-      </w:tblGrid>
-      <w:tr>
-        <w:trPr>
-          <w:cantSplit/>
-          <w:tblHeader w:val="true"/>
-        </w:trPr>
-        <w:tc>
-          <w:tcPr>
-            <w:tcW w:type="dxa" w:w="2857"/>
-            <w:shd w:val="clear" w:fill="1F2A44"/>
-          </w:tcPr>
-          <w:p>
-            <w:pPr>
-              <w:spacing w:after="0"/>
-              <w:jc w:val="left"/>
-            </w:pPr>
-            <w:r/>
-            <w:r>
-              <w:rPr>
-                <w:rFonts w:ascii="Georgia" w:hAnsi="Georgia"/>
-                <w:b/>
-                <w:i w:val="0"/>
-                <w:color w:val="FFFFFF"/>
-                <w:sz w:val="17"/>
-              </w:rPr>
-              <w:t>Sub-score</w:t>
-            </w:r>
-          </w:p>
-        </w:tc>
-        <w:tc>
-          <w:tcPr>
-            <w:tcW w:type="dxa" w:w="700"/>
-            <w:shd w:val="clear" w:fill="1F2A44"/>
-          </w:tcPr>
-          <w:p>
-            <w:pPr>
-              <w:spacing w:after="0"/>
-              <w:jc w:val="right"/>
-            </w:pPr>
-            <w:r/>
-            <w:r>
-              <w:rPr>
-                <w:rFonts w:ascii="Georgia" w:hAnsi="Georgia"/>
-                <w:b/>
-                <w:i w:val="0"/>
-                <w:color w:val="FFFFFF"/>
-                <w:sz w:val="17"/>
-              </w:rPr>
-              <w:t>Score</w:t>
-            </w:r>
-          </w:p>
-        </w:tc>
-        <w:tc>
-          <w:tcPr>
-            <w:tcW w:type="dxa" w:w="5911"/>
-            <w:shd w:val="clear" w:fill="1F2A44"/>
-          </w:tcPr>
-          <w:p>
-            <w:pPr>
-              <w:spacing w:after="0"/>
-              <w:jc w:val="left"/>
-            </w:pPr>
-            <w:r/>
-            <w:r>
-              <w:rPr>
-                <w:rFonts w:ascii="Georgia" w:hAnsi="Georgia"/>
-                <w:b/>
-                <w:i w:val="0"/>
-                <w:color w:val="FFFFFF"/>
-                <w:sz w:val="17"/>
-              </w:rPr>
-              <w:t>Basis (dated)</w:t>
-            </w:r>
-          </w:p>
-        </w:tc>
-      </w:tr>
-      <w:tr>
-        <w:trPr>
-          <w:cantSplit/>
-        </w:trPr>
-        <w:tc>
-          <w:tcPr>
-            <w:tcW w:type="dxa" w:w="2857"/>
-          </w:tcPr>
-          <w:p>
-            <w:pPr>
-              <w:spacing w:after="0"/>
-              <w:jc w:val="left"/>
-            </w:pPr>
-            <w:r/>
-            <w:r>
-              <w:rPr>
-                <w:rFonts w:ascii="Georgia" w:hAnsi="Georgia"/>
-                <w:b w:val="0"/>
-                <w:i w:val="0"/>
-                <w:color w:val="262B35"/>
-                <w:sz w:val="16"/>
-              </w:rPr>
-              <w:t>Board and investor structure</w:t>
-            </w:r>
-          </w:p>
-        </w:tc>
-        <w:tc>
-          <w:tcPr>
-            <w:tcW w:type="dxa" w:w="700"/>
-          </w:tcPr>
-          <w:p>
-            <w:pPr>
-              <w:spacing w:after="0"/>
-              <w:jc w:val="right"/>
-            </w:pPr>
-            <w:r/>
-            <w:r>
-              <w:rPr>
-                <w:rFonts w:ascii="Georgia" w:hAnsi="Georgia"/>
-                <w:b w:val="0"/>
-                <w:i w:val="0"/>
-                <w:color w:val="262B35"/>
-                <w:sz w:val="16"/>
-              </w:rPr>
-              <w:t>8.8</w:t>
-            </w:r>
-          </w:p>
-        </w:tc>
-        <w:tc>
-          <w:tcPr>
-            <w:tcW w:type="dxa" w:w="5911"/>
-          </w:tcPr>
-          <w:p>
-            <w:pPr>
-              <w:spacing w:after="0"/>
-              <w:jc w:val="left"/>
-            </w:pPr>
-            <w:r/>
-            <w:r>
-              <w:rPr>
-                <w:rFonts w:ascii="Georgia" w:hAnsi="Georgia"/>
-                <w:b w:val="0"/>
-                <w:i w:val="0"/>
-                <w:color w:val="262B35"/>
-                <w:sz w:val="16"/>
-              </w:rPr>
-              <w:t>Crossover-heavy register: Fidelity, Insight, J.P. Morgan Growth Equity, Microsoft and ~44 others in the final close alone; 148 active investors (PitchBook, Jul 2026)</w:t>
-            </w:r>
-          </w:p>
-        </w:tc>
-      </w:tr>
-      <w:tr>
-        <w:trPr>
-          <w:cantSplit/>
-        </w:trPr>
-        <w:tc>
-          <w:tcPr>
-            <w:tcW w:type="dxa" w:w="2857"/>
-            <w:shd w:val="clear" w:fill="F2F5F9"/>
-          </w:tcPr>
-          <w:p>
-            <w:pPr>
-              <w:spacing w:after="0"/>
-              <w:jc w:val="left"/>
-            </w:pPr>
-            <w:r/>
-            <w:r>
-              <w:rPr>
-                <w:rFonts w:ascii="Georgia" w:hAnsi="Georgia"/>
-                <w:b w:val="0"/>
-                <w:i w:val="0"/>
-                <w:color w:val="262B35"/>
-                <w:sz w:val="16"/>
-              </w:rPr>
-              <w:t>Reporting and audit readiness</w:t>
-            </w:r>
-          </w:p>
-        </w:tc>
-        <w:tc>
-          <w:tcPr>
-            <w:tcW w:type="dxa" w:w="700"/>
-            <w:shd w:val="clear" w:fill="F2F5F9"/>
-          </w:tcPr>
-          <w:p>
-            <w:pPr>
-              <w:spacing w:after="0"/>
-              <w:jc w:val="right"/>
-            </w:pPr>
-            <w:r/>
-            <w:r>
-              <w:rPr>
-                <w:rFonts w:ascii="Georgia" w:hAnsi="Georgia"/>
-                <w:b w:val="0"/>
-                <w:i w:val="0"/>
-                <w:color w:val="262B35"/>
-                <w:sz w:val="16"/>
-              </w:rPr>
-              <w:t>9.2</w:t>
-            </w:r>
-          </w:p>
-        </w:tc>
-        <w:tc>
-          <w:tcPr>
-            <w:tcW w:type="dxa" w:w="5911"/>
-            <w:shd w:val="clear" w:fill="F2F5F9"/>
-          </w:tcPr>
-          <w:p>
-            <w:pPr>
-              <w:spacing w:after="0"/>
-              <w:jc w:val="left"/>
-            </w:pPr>
-            <w:r/>
-            <w:r>
-              <w:rPr>
-                <w:rFonts w:ascii="Georgia" w:hAnsi="Georgia"/>
-                <w:b w:val="0"/>
-                <w:i w:val="0"/>
-                <w:color w:val="262B35"/>
-                <w:sz w:val="16"/>
-              </w:rPr>
-              <w:t>Quarterly public run-rate cadence since 2025; FCF disclosed on TTM and fiscal-year bases</w:t>
-            </w:r>
-          </w:p>
-        </w:tc>
-      </w:tr>
-      <w:tr>
-        <w:trPr>
-          <w:cantSplit/>
-        </w:trPr>
-        <w:tc>
-          <w:tcPr>
-            <w:tcW w:type="dxa" w:w="2857"/>
-          </w:tcPr>
-          <w:p>
-            <w:pPr>
-              <w:spacing w:after="0"/>
-              <w:jc w:val="left"/>
-            </w:pPr>
-            <w:r/>
-            <w:r>
-              <w:rPr>
-                <w:rFonts w:ascii="Georgia" w:hAnsi="Georgia"/>
-                <w:b w:val="0"/>
-                <w:i w:val="0"/>
-                <w:color w:val="262B35"/>
-                <w:sz w:val="16"/>
-              </w:rPr>
-              <w:t>Control and alignment</w:t>
-            </w:r>
-          </w:p>
-        </w:tc>
-        <w:tc>
-          <w:tcPr>
-            <w:tcW w:type="dxa" w:w="700"/>
-          </w:tcPr>
-          <w:p>
-            <w:pPr>
-              <w:spacing w:after="0"/>
-              <w:jc w:val="right"/>
-            </w:pPr>
-            <w:r/>
-            <w:r>
-              <w:rPr>
-                <w:rFonts w:ascii="Georgia" w:hAnsi="Georgia"/>
-                <w:b w:val="0"/>
-                <w:i w:val="0"/>
-                <w:color w:val="262B35"/>
-                <w:sz w:val="16"/>
-              </w:rPr>
-              <w:t>8.4</w:t>
-            </w:r>
-          </w:p>
-        </w:tc>
-        <w:tc>
-          <w:tcPr>
-            <w:tcW w:type="dxa" w:w="5911"/>
-          </w:tcPr>
-          <w:p>
-            <w:pPr>
-              <w:spacing w:after="0"/>
-              <w:jc w:val="left"/>
-            </w:pPr>
-            <w:r/>
-            <w:r>
-              <w:rPr>
-                <w:rFonts w:ascii="Georgia" w:hAnsi="Georgia"/>
-                <w:b w:val="0"/>
-                <w:i w:val="0"/>
-                <w:color w:val="262B35"/>
-                <w:sz w:val="16"/>
-              </w:rPr>
-              <w:t>Founder-led with institutional depth; no exotic control instruments disclosed</w:t>
-            </w:r>
-          </w:p>
-        </w:tc>
-      </w:tr>
-      <w:tr>
-        <w:trPr>
-          <w:cantSplit/>
-        </w:trPr>
-        <w:tc>
-          <w:tcPr>
-            <w:tcW w:type="dxa" w:w="2857"/>
-            <w:shd w:val="clear" w:fill="F2F5F9"/>
-          </w:tcPr>
-          <w:p>
-            <w:pPr>
-              <w:spacing w:after="0"/>
-              <w:jc w:val="left"/>
-            </w:pPr>
-            <w:r/>
-            <w:r>
-              <w:rPr>
-                <w:rFonts w:ascii="Georgia" w:hAnsi="Georgia"/>
-                <w:b w:val="0"/>
-                <w:i w:val="0"/>
-                <w:color w:val="262B35"/>
-                <w:sz w:val="16"/>
-              </w:rPr>
-              <w:t>Disclosure cadence</w:t>
-            </w:r>
-          </w:p>
-        </w:tc>
-        <w:tc>
-          <w:tcPr>
-            <w:tcW w:type="dxa" w:w="700"/>
-            <w:shd w:val="clear" w:fill="F2F5F9"/>
-          </w:tcPr>
-          <w:p>
-            <w:pPr>
-              <w:spacing w:after="0"/>
-              <w:jc w:val="right"/>
-            </w:pPr>
-            <w:r/>
-            <w:r>
-              <w:rPr>
-                <w:rFonts w:ascii="Georgia" w:hAnsi="Georgia"/>
-                <w:b w:val="0"/>
-                <w:i w:val="0"/>
-                <w:color w:val="262B35"/>
-                <w:sz w:val="16"/>
-              </w:rPr>
-              <w:t>9.3</w:t>
-            </w:r>
-          </w:p>
-        </w:tc>
-        <w:tc>
-          <w:tcPr>
-            <w:tcW w:type="dxa" w:w="5911"/>
-            <w:shd w:val="clear" w:fill="F2F5F9"/>
-          </w:tcPr>
-          <w:p>
-            <w:pPr>
-              <w:spacing w:after="0"/>
-              <w:jc w:val="left"/>
-            </w:pPr>
-            <w:r/>
-            <w:r>
-              <w:rPr>
-                <w:rFonts w:ascii="Georgia" w:hAnsi="Georgia"/>
-                <w:b w:val="0"/>
-                <w:i w:val="0"/>
-                <w:color w:val="262B35"/>
-                <w:sz w:val="16"/>
-              </w:rPr>
-              <w:t>Four dated public prints in ten months; definitional conflicts rare and explainable</w:t>
-            </w:r>
-          </w:p>
-        </w:tc>
-      </w:tr>
-      <w:tr>
-        <w:trPr>
-          <w:cantSplit/>
-        </w:trPr>
-        <w:tc>
-          <w:tcPr>
-            <w:tcW w:type="dxa" w:w="2857"/>
-          </w:tcPr>
-          <w:p>
-            <w:pPr>
-              <w:spacing w:after="0"/>
-              <w:jc w:val="left"/>
-            </w:pPr>
-            <w:r/>
-            <w:r>
-              <w:rPr>
-                <w:rFonts w:ascii="Georgia" w:hAnsi="Georgia"/>
-                <w:b w:val="0"/>
-                <w:i w:val="0"/>
-                <w:color w:val="262B35"/>
-                <w:sz w:val="16"/>
-              </w:rPr>
-              <w:t>Listing optionality</w:t>
-            </w:r>
-          </w:p>
-        </w:tc>
-        <w:tc>
-          <w:tcPr>
-            <w:tcW w:type="dxa" w:w="700"/>
-          </w:tcPr>
-          <w:p>
-            <w:pPr>
-              <w:spacing w:after="0"/>
-              <w:jc w:val="right"/>
-            </w:pPr>
-            <w:r/>
-            <w:r>
-              <w:rPr>
-                <w:rFonts w:ascii="Georgia" w:hAnsi="Georgia"/>
-                <w:b w:val="0"/>
-                <w:i w:val="0"/>
-                <w:color w:val="262B35"/>
-                <w:sz w:val="16"/>
-              </w:rPr>
-              <w:t>8.8</w:t>
-            </w:r>
-          </w:p>
-        </w:tc>
-        <w:tc>
-          <w:tcPr>
-            <w:tcW w:type="dxa" w:w="5911"/>
-          </w:tcPr>
-          <w:p>
-            <w:pPr>
-              <w:spacing w:after="0"/>
-              <w:jc w:val="left"/>
-            </w:pPr>
-            <w:r/>
-            <w:r>
-              <w:rPr>
-                <w:rFonts w:ascii="Georgia" w:hAnsi="Georgia"/>
-                <w:b w:val="0"/>
-                <w:i w:val="0"/>
-                <w:color w:val="262B35"/>
-                <w:sz w:val="16"/>
-              </w:rPr>
-              <w:t>Can list at will and chooses not to; imminence premium (0.5) removed on 2027-earliest guidance (company, Jun 4, 2026)</w:t>
-            </w:r>
-          </w:p>
-        </w:tc>
-      </w:tr>
-    </w:tbl>
-    <w:p>
-      <w:pPr>
-        <w:spacing w:after="200"/>
-        <w:jc w:val="left"/>
-      </w:pPr>
-      <w:r>
-        <w:rPr>
-          <w:b w:val="0"/>
-          <w:i/>
-          <w:color w:val="6B7280"/>
-          <w:sz w:val="15"/>
-        </w:rPr>
-        <w:t>Simple average 8.9. Prediction markets price no listing by end-2027 as a slight favorite (Jul 7, 2026); the framework scores optionality, not imminence.</w:t>
+        <w:t>GO measures whether the company can access public markets on its own timetable, and whether its governance would survive the scrutiny when it does. Databricks scores 8.9, down from an effective 9.4: the 0.5-point imminence premium tied to a second-half-2026 filing has been removed, because no S-1 is on file (SEC EDGAR, CIK 1587468, verified July 10, 2026; Form D filings only) and the chief executive has publicly ruled 2026 out, with 2027 the earliest window (company, June 4, 2026). What remains is still exceptional. The company keeps a public-company disclosure cadence while private: four dated financial prints in ten months with consistent metric definitions, free cash flow disclosed on trailing and fiscal bases. The investor register already resembles a public one: Fidelity, Insight, J.P. Morgan Growth Equity, Microsoft and roughly 44 others in the final close alone, 148 active investors in total (PitchBook, July 2026), with no exotic control instruments disclosed. And critically, the company owns the luxury of choosing its window: waiting is a governance strength, not a weakness, when positive free cash flow means it never has to file into a bad market. The framework scores that optionality, not imminence.</w:t>
       </w:r>
     </w:p>
     <w:p>
@@ -5702,7 +3797,7 @@
         <w:pStyle w:val="Heading2"/>
       </w:pPr>
       <w:r>
-        <w:t>Moat and Defensibility: 9.0 (weight 20%)</w:t>
+        <w:t>Moat Durability: 9.0 (weight 20%)</w:t>
       </w:r>
     </w:p>
     <w:p>
@@ -5717,501 +3812,7 @@
           <w:color w:val="262B35"/>
           <w:sz w:val="21"/>
         </w:rPr>
-        <w:t>MD is where the lakehouse architecture pays its rent. The moat is data gravity: once petabyte-scale estates sit in Delta Lake under Unity Catalog governance, with lineage, permissions, and audit history attached, the cost of leaving is not the storage bill, it is re-certifying every downstream pipeline, model, and compliance attestation. The paradox that makes it durable is that Databricks built the moat on open formats: openness removed the adoption objection that kills proprietary platforms, while the switching cost migrated up the stack into governance and workflow, where it is stickier. Hyperscaler co-opetition is deliberately scored under CI, not here; the moat question is customer exit cost, not supplier power.</w:t>
-      </w:r>
-    </w:p>
-    <w:p>
-      <w:pPr>
-        <w:keepNext/>
-        <w:spacing w:after="60"/>
-        <w:jc w:val="left"/>
-      </w:pPr>
-      <w:r>
-        <w:rPr>
-          <w:b/>
-          <w:i w:val="0"/>
-          <w:color w:val="1F2A44"/>
-          <w:sz w:val="19"/>
-        </w:rPr>
-        <w:t>MD sub-scores (5)</w:t>
-      </w:r>
-    </w:p>
-    <w:tbl>
-      <w:tblPr>
-        <w:tblW w:type="dxa" w:w="9360"/>
-        <w:jc w:val="center"/>
-        <w:tblLayout w:type="fixed"/>
-        <w:tblLook w:firstColumn="1" w:firstRow="1" w:lastColumn="0" w:lastRow="0" w:noHBand="0" w:noVBand="1" w:val="04A0"/>
-        <w:tblBorders>
-          <w:top w:val="single" w:sz="4" w:space="0" w:color="C9D2DE"/>
-          <w:left w:val="single" w:sz="4" w:space="0" w:color="C9D2DE"/>
-          <w:bottom w:val="single" w:sz="4" w:space="0" w:color="C9D2DE"/>
-          <w:right w:val="single" w:sz="4" w:space="0" w:color="C9D2DE"/>
-          <w:insideH w:val="single" w:sz="4" w:space="0" w:color="C9D2DE"/>
-          <w:insideV w:val="single" w:sz="4" w:space="0" w:color="C9D2DE"/>
-        </w:tblBorders>
-        <w:tblCellMar>
-          <w:top w:w="40" w:type="dxa"/>
-          <w:left w:w="80" w:type="dxa"/>
-          <w:bottom w:w="40" w:type="dxa"/>
-          <w:right w:w="80" w:type="dxa"/>
-        </w:tblCellMar>
-      </w:tblPr>
-      <w:tblGrid>
-        <w:gridCol w:w="3120"/>
-        <w:gridCol w:w="3120"/>
-        <w:gridCol w:w="3120"/>
-      </w:tblGrid>
-      <w:tr>
-        <w:trPr>
-          <w:cantSplit/>
-          <w:tblHeader w:val="true"/>
-        </w:trPr>
-        <w:tc>
-          <w:tcPr>
-            <w:tcW w:type="dxa" w:w="3056"/>
-            <w:shd w:val="clear" w:fill="1F2A44"/>
-          </w:tcPr>
-          <w:p>
-            <w:pPr>
-              <w:spacing w:after="0"/>
-              <w:jc w:val="left"/>
-            </w:pPr>
-            <w:r/>
-            <w:r>
-              <w:rPr>
-                <w:rFonts w:ascii="Georgia" w:hAnsi="Georgia"/>
-                <w:b/>
-                <w:i w:val="0"/>
-                <w:color w:val="FFFFFF"/>
-                <w:sz w:val="17"/>
-              </w:rPr>
-              <w:t>Sub-score</w:t>
-            </w:r>
-          </w:p>
-        </w:tc>
-        <w:tc>
-          <w:tcPr>
-            <w:tcW w:type="dxa" w:w="700"/>
-            <w:shd w:val="clear" w:fill="1F2A44"/>
-          </w:tcPr>
-          <w:p>
-            <w:pPr>
-              <w:spacing w:after="0"/>
-              <w:jc w:val="right"/>
-            </w:pPr>
-            <w:r/>
-            <w:r>
-              <w:rPr>
-                <w:rFonts w:ascii="Georgia" w:hAnsi="Georgia"/>
-                <w:b/>
-                <w:i w:val="0"/>
-                <w:color w:val="FFFFFF"/>
-                <w:sz w:val="17"/>
-              </w:rPr>
-              <w:t>Score</w:t>
-            </w:r>
-          </w:p>
-        </w:tc>
-        <w:tc>
-          <w:tcPr>
-            <w:tcW w:type="dxa" w:w="5730"/>
-            <w:shd w:val="clear" w:fill="1F2A44"/>
-          </w:tcPr>
-          <w:p>
-            <w:pPr>
-              <w:spacing w:after="0"/>
-              <w:jc w:val="left"/>
-            </w:pPr>
-            <w:r/>
-            <w:r>
-              <w:rPr>
-                <w:rFonts w:ascii="Georgia" w:hAnsi="Georgia"/>
-                <w:b/>
-                <w:i w:val="0"/>
-                <w:color w:val="FFFFFF"/>
-                <w:sz w:val="17"/>
-              </w:rPr>
-              <w:t>Basis (dated)</w:t>
-            </w:r>
-          </w:p>
-        </w:tc>
-      </w:tr>
-      <w:tr>
-        <w:trPr>
-          <w:cantSplit/>
-        </w:trPr>
-        <w:tc>
-          <w:tcPr>
-            <w:tcW w:type="dxa" w:w="3056"/>
-          </w:tcPr>
-          <w:p>
-            <w:pPr>
-              <w:spacing w:after="0"/>
-              <w:jc w:val="left"/>
-            </w:pPr>
-            <w:r/>
-            <w:r>
-              <w:rPr>
-                <w:rFonts w:ascii="Georgia" w:hAnsi="Georgia"/>
-                <w:b w:val="0"/>
-                <w:i w:val="0"/>
-                <w:color w:val="262B35"/>
-                <w:sz w:val="16"/>
-              </w:rPr>
-              <w:t>Data gravity and switching costs</w:t>
-            </w:r>
-          </w:p>
-        </w:tc>
-        <w:tc>
-          <w:tcPr>
-            <w:tcW w:type="dxa" w:w="700"/>
-          </w:tcPr>
-          <w:p>
-            <w:pPr>
-              <w:spacing w:after="0"/>
-              <w:jc w:val="right"/>
-            </w:pPr>
-            <w:r/>
-            <w:r>
-              <w:rPr>
-                <w:rFonts w:ascii="Georgia" w:hAnsi="Georgia"/>
-                <w:b w:val="0"/>
-                <w:i w:val="0"/>
-                <w:color w:val="262B35"/>
-                <w:sz w:val="16"/>
-              </w:rPr>
-              <w:t>9.5</w:t>
-            </w:r>
-          </w:p>
-        </w:tc>
-        <w:tc>
-          <w:tcPr>
-            <w:tcW w:type="dxa" w:w="5730"/>
-          </w:tcPr>
-          <w:p>
-            <w:pPr>
-              <w:spacing w:after="0"/>
-              <w:jc w:val="left"/>
-            </w:pPr>
-            <w:r/>
-            <w:r>
-              <w:rPr>
-                <w:rFonts w:ascii="Georgia" w:hAnsi="Georgia"/>
-                <w:b w:val="0"/>
-                <w:i w:val="0"/>
-                <w:color w:val="262B35"/>
-                <w:sz w:val="16"/>
-              </w:rPr>
-              <w:t>Petabyte-scale estates under Unity Catalog governance; migration cost is re-certification, not storage</w:t>
-            </w:r>
-          </w:p>
-        </w:tc>
-      </w:tr>
-      <w:tr>
-        <w:trPr>
-          <w:cantSplit/>
-        </w:trPr>
-        <w:tc>
-          <w:tcPr>
-            <w:tcW w:type="dxa" w:w="3056"/>
-            <w:shd w:val="clear" w:fill="F2F5F9"/>
-          </w:tcPr>
-          <w:p>
-            <w:pPr>
-              <w:spacing w:after="0"/>
-              <w:jc w:val="left"/>
-            </w:pPr>
-            <w:r/>
-            <w:r>
-              <w:rPr>
-                <w:rFonts w:ascii="Georgia" w:hAnsi="Georgia"/>
-                <w:b w:val="0"/>
-                <w:i w:val="0"/>
-                <w:color w:val="262B35"/>
-                <w:sz w:val="16"/>
-              </w:rPr>
-              <w:t>Open-format paradox</w:t>
-            </w:r>
-          </w:p>
-        </w:tc>
-        <w:tc>
-          <w:tcPr>
-            <w:tcW w:type="dxa" w:w="700"/>
-            <w:shd w:val="clear" w:fill="F2F5F9"/>
-          </w:tcPr>
-          <w:p>
-            <w:pPr>
-              <w:spacing w:after="0"/>
-              <w:jc w:val="right"/>
-            </w:pPr>
-            <w:r/>
-            <w:r>
-              <w:rPr>
-                <w:rFonts w:ascii="Georgia" w:hAnsi="Georgia"/>
-                <w:b w:val="0"/>
-                <w:i w:val="0"/>
-                <w:color w:val="262B35"/>
-                <w:sz w:val="16"/>
-              </w:rPr>
-              <w:t>8.9</w:t>
-            </w:r>
-          </w:p>
-        </w:tc>
-        <w:tc>
-          <w:tcPr>
-            <w:tcW w:type="dxa" w:w="5730"/>
-            <w:shd w:val="clear" w:fill="F2F5F9"/>
-          </w:tcPr>
-          <w:p>
-            <w:pPr>
-              <w:spacing w:after="0"/>
-              <w:jc w:val="left"/>
-            </w:pPr>
-            <w:r/>
-            <w:r>
-              <w:rPr>
-                <w:rFonts w:ascii="Georgia" w:hAnsi="Georgia"/>
-                <w:b w:val="0"/>
-                <w:i w:val="0"/>
-                <w:color w:val="262B35"/>
-                <w:sz w:val="16"/>
-              </w:rPr>
-              <w:t>Open Delta/Iceberg posture (Tabular, 2024) removes adoption friction; lock-in migrates to the governance layer</w:t>
-            </w:r>
-          </w:p>
-        </w:tc>
-      </w:tr>
-      <w:tr>
-        <w:trPr>
-          <w:cantSplit/>
-        </w:trPr>
-        <w:tc>
-          <w:tcPr>
-            <w:tcW w:type="dxa" w:w="3056"/>
-          </w:tcPr>
-          <w:p>
-            <w:pPr>
-              <w:spacing w:after="0"/>
-              <w:jc w:val="left"/>
-            </w:pPr>
-            <w:r/>
-            <w:r>
-              <w:rPr>
-                <w:rFonts w:ascii="Georgia" w:hAnsi="Georgia"/>
-                <w:b w:val="0"/>
-                <w:i w:val="0"/>
-                <w:color w:val="262B35"/>
-                <w:sz w:val="16"/>
-              </w:rPr>
-              <w:t>Ecosystem breadth</w:t>
-            </w:r>
-          </w:p>
-        </w:tc>
-        <w:tc>
-          <w:tcPr>
-            <w:tcW w:type="dxa" w:w="700"/>
-          </w:tcPr>
-          <w:p>
-            <w:pPr>
-              <w:spacing w:after="0"/>
-              <w:jc w:val="right"/>
-            </w:pPr>
-            <w:r/>
-            <w:r>
-              <w:rPr>
-                <w:rFonts w:ascii="Georgia" w:hAnsi="Georgia"/>
-                <w:b w:val="0"/>
-                <w:i w:val="0"/>
-                <w:color w:val="262B35"/>
-                <w:sz w:val="16"/>
-              </w:rPr>
-              <w:t>9.0</w:t>
-            </w:r>
-          </w:p>
-        </w:tc>
-        <w:tc>
-          <w:tcPr>
-            <w:tcW w:type="dxa" w:w="5730"/>
-          </w:tcPr>
-          <w:p>
-            <w:pPr>
-              <w:spacing w:after="0"/>
-              <w:jc w:val="left"/>
-            </w:pPr>
-            <w:r/>
-            <w:r>
-              <w:rPr>
-                <w:rFonts w:ascii="Georgia" w:hAnsi="Georgia"/>
-                <w:b w:val="0"/>
-                <w:i w:val="0"/>
-                <w:color w:val="262B35"/>
-                <w:sz w:val="16"/>
-              </w:rPr>
-              <w:t>&gt;20,000 organizations; &gt;60% of the Fortune 500 (company, Feb 2026); ~9,000 employees across 47 offices (PitchBook, Jun 2026)</w:t>
-            </w:r>
-          </w:p>
-        </w:tc>
-      </w:tr>
-      <w:tr>
-        <w:trPr>
-          <w:cantSplit/>
-        </w:trPr>
-        <w:tc>
-          <w:tcPr>
-            <w:tcW w:type="dxa" w:w="3056"/>
-            <w:shd w:val="clear" w:fill="F2F5F9"/>
-          </w:tcPr>
-          <w:p>
-            <w:pPr>
-              <w:spacing w:after="0"/>
-              <w:jc w:val="left"/>
-            </w:pPr>
-            <w:r/>
-            <w:r>
-              <w:rPr>
-                <w:rFonts w:ascii="Georgia" w:hAnsi="Georgia"/>
-                <w:b w:val="0"/>
-                <w:i w:val="0"/>
-                <w:color w:val="262B35"/>
-                <w:sz w:val="16"/>
-              </w:rPr>
-              <w:t>Acquisition integration record</w:t>
-            </w:r>
-          </w:p>
-        </w:tc>
-        <w:tc>
-          <w:tcPr>
-            <w:tcW w:type="dxa" w:w="700"/>
-            <w:shd w:val="clear" w:fill="F2F5F9"/>
-          </w:tcPr>
-          <w:p>
-            <w:pPr>
-              <w:spacing w:after="0"/>
-              <w:jc w:val="right"/>
-            </w:pPr>
-            <w:r/>
-            <w:r>
-              <w:rPr>
-                <w:rFonts w:ascii="Georgia" w:hAnsi="Georgia"/>
-                <w:b w:val="0"/>
-                <w:i w:val="0"/>
-                <w:color w:val="262B35"/>
-                <w:sz w:val="16"/>
-              </w:rPr>
-              <w:t>8.8</w:t>
-            </w:r>
-          </w:p>
-        </w:tc>
-        <w:tc>
-          <w:tcPr>
-            <w:tcW w:type="dxa" w:w="5730"/>
-            <w:shd w:val="clear" w:fill="F2F5F9"/>
-          </w:tcPr>
-          <w:p>
-            <w:pPr>
-              <w:spacing w:after="0"/>
-              <w:jc w:val="left"/>
-            </w:pPr>
-            <w:r/>
-            <w:r>
-              <w:rPr>
-                <w:rFonts w:ascii="Georgia" w:hAnsi="Georgia"/>
-                <w:b w:val="0"/>
-                <w:i w:val="0"/>
-                <w:color w:val="262B35"/>
-                <w:sz w:val="16"/>
-              </w:rPr>
-              <w:t>~19 deals absorbed without visible failure; MosaicML (2023, ~$1.3B) now anchors the $1.7B AI line; Neon became Lakebase</w:t>
-            </w:r>
-          </w:p>
-        </w:tc>
-      </w:tr>
-      <w:tr>
-        <w:trPr>
-          <w:cantSplit/>
-        </w:trPr>
-        <w:tc>
-          <w:tcPr>
-            <w:tcW w:type="dxa" w:w="3056"/>
-          </w:tcPr>
-          <w:p>
-            <w:pPr>
-              <w:spacing w:after="0"/>
-              <w:jc w:val="left"/>
-            </w:pPr>
-            <w:r/>
-            <w:r>
-              <w:rPr>
-                <w:rFonts w:ascii="Georgia" w:hAnsi="Georgia"/>
-                <w:b w:val="0"/>
-                <w:i w:val="0"/>
-                <w:color w:val="262B35"/>
-                <w:sz w:val="16"/>
-              </w:rPr>
-              <w:t>Category definition power</w:t>
-            </w:r>
-          </w:p>
-        </w:tc>
-        <w:tc>
-          <w:tcPr>
-            <w:tcW w:type="dxa" w:w="700"/>
-          </w:tcPr>
-          <w:p>
-            <w:pPr>
-              <w:spacing w:after="0"/>
-              <w:jc w:val="right"/>
-            </w:pPr>
-            <w:r/>
-            <w:r>
-              <w:rPr>
-                <w:rFonts w:ascii="Georgia" w:hAnsi="Georgia"/>
-                <w:b w:val="0"/>
-                <w:i w:val="0"/>
-                <w:color w:val="262B35"/>
-                <w:sz w:val="16"/>
-              </w:rPr>
-              <w:t>8.8</w:t>
-            </w:r>
-          </w:p>
-        </w:tc>
-        <w:tc>
-          <w:tcPr>
-            <w:tcW w:type="dxa" w:w="5730"/>
-          </w:tcPr>
-          <w:p>
-            <w:pPr>
-              <w:spacing w:after="0"/>
-              <w:jc w:val="left"/>
-            </w:pPr>
-            <w:r/>
-            <w:r>
-              <w:rPr>
-                <w:rFonts w:ascii="Georgia" w:hAnsi="Georgia"/>
-                <w:b w:val="0"/>
-                <w:i w:val="0"/>
-                <w:color w:val="262B35"/>
-                <w:sz w:val="16"/>
-              </w:rPr>
-              <w:t>Coined and owns 'lakehouse'; competitors now advertise in its vocabulary</w:t>
-            </w:r>
-          </w:p>
-        </w:tc>
-      </w:tr>
-    </w:tbl>
-    <w:p>
-      <w:pPr>
-        <w:spacing w:after="200"/>
-        <w:jc w:val="left"/>
-      </w:pPr>
-      <w:r>
-        <w:rPr>
-          <w:b w:val="0"/>
-          <w:i/>
-          <w:color w:val="6B7280"/>
-          <w:sz w:val="15"/>
-        </w:rPr>
-        <w:t>Simple average 9.0.</w:t>
+        <w:t>MD is where the lakehouse architecture pays its rent, and the question is strictly the customer's: what does it cost to leave, and is that cost rising? The moat is data gravity. Once petabyte-scale estates sit in Delta Lake under Unity Catalog governance, with lineage, permissions, and audit history attached, the cost of leaving is not the storage bill, it is re-certifying every downstream pipeline, model, and compliance attestation an auditor ever signed. The paradox that makes the moat durable is that it was built on open formats: openness removed the adoption objection that kills proprietary platforms (reinforced by the 2024 Tabular acquisition, which brought the rival Iceberg format's founders in-house), while the switching cost quietly migrated up the stack into governance and workflow, where it is stickier than any file format. The moat also widens on its own evidence: more than 20,000 organizations and over 60% of the Fortune 500 sit on the platform, roughly nineteen acquisitions have been absorbed without visible integration failure, and the company named its category, so thoroughly that competitors now advertise in its vocabulary. Every new layer adopted, warehouse, AI, agents, security, raises the exit cost again, which is precisely the rising-cost trajectory a 9.0 requires. Hyperscaler co-opetition is deliberately scored under CI, not here; the moat question is customer exit cost, not supplier power.</w:t>
       </w:r>
     </w:p>
     <w:p>
@@ -6867,7 +4468,7 @@
           <w:color w:val="262B35"/>
           <w:sz w:val="21"/>
         </w:rPr>
-        <w:t>The AIBQ Breakdown (preceding this summary): the quality score in full, all 24 sub-scores, and the one number that falsifies it.</w:t>
+        <w:t>The AIBQ Breakdown (preceding this summary): the five quality dimensions in full, and the one number that falsifies the score.</w:t>
       </w:r>
     </w:p>
     <w:p>
@@ -12056,7 +9657,7 @@
           <w:color w:val="262B35"/>
           <w:sz w:val="21"/>
         </w:rPr>
-        <w:t>The quality itself was established at the front of this report: 8.81, the cohort's only Elite rating, decomposed across 24 sub-scores in The AIBQ Breakdown, with the 70% margin gate as its one binding constraint. What this pass adds is the price of each point. At $134 billion, the market pays $15.2 billion per AIBQ point for Databricks, against roughly $118 billion per point for Anthropic, $188 billion for OpenAI, and roughly $345 billion estimated for xAI (Figure 2). Part of the spread is rational, and the honest version of the counterargument deserves stating: the labs carry genuine option value on artificial general intelligence that no data platform participates in, and their marks re-rate upward mechanically because they must raise continuously while Databricks held its mark flat precisely because it needed nothing. But option value explains a premium, not an 8-to-23-fold premium per unit of quality over a business growing 80% with positive free cash flow. The residual is category confusion, and category confusion is exactly what a public listing prices out.</w:t>
+        <w:t>The quality itself was established at the front of this report: 8.81, the cohort's only Elite rating, established dimension by dimension in The AIBQ Breakdown, with the 70% margin gate as its one binding constraint. What this pass adds is the price of each point. At $134 billion, the market pays $15.2 billion per AIBQ point for Databricks, against roughly $118 billion per point for Anthropic, $188 billion for OpenAI, and roughly $345 billion estimated for xAI (Figure 2). Part of the spread is rational, and the honest version of the counterargument deserves stating: the labs carry genuine option value on artificial general intelligence that no data platform participates in, and their marks re-rate upward mechanically because they must raise continuously while Databricks held its mark flat precisely because it needed nothing. But option value explains a premium, not an 8-to-23-fold premium per unit of quality over a business growing 80% with positive free cash flow. The residual is category confusion, and category confusion is exactly what a public listing prices out.</w:t>
       </w:r>
     </w:p>
     <w:p>

</xml_diff>